<commit_message>
Update recent experience in dev resume
</commit_message>
<xml_diff>
--- a/resume/dev/Harshit_Jindal_SDE.docx
+++ b/resume/dev/Harshit_Jindal_SDE.docx
@@ -379,7 +379,7 @@
                 <w:sz w:val="20"/>
                 <w:szCs w:val="20"/>
               </w:rPr>
-              <w:t>S</w:t>
+              <w:t>Backend s</w:t>
             </w:r>
             <w:r>
               <w:rPr>
@@ -404,7 +404,7 @@
                 <w:sz w:val="20"/>
                 <w:szCs w:val="20"/>
               </w:rPr>
-              <w:t>working on</w:t>
+              <w:t>for</w:t>
             </w:r>
             <w:r>
               <w:rPr>
@@ -420,7 +420,15 @@
                 <w:sz w:val="20"/>
                 <w:szCs w:val="20"/>
               </w:rPr>
-              <w:t xml:space="preserve">the </w:t>
+              <w:t>a critical</w:t>
+            </w:r>
+            <w:r>
+              <w:rPr>
+                <w:rFonts w:ascii="Calibri" w:hAnsi="Calibri" w:cs="Calibri"/>
+                <w:sz w:val="20"/>
+                <w:szCs w:val="20"/>
+              </w:rPr>
+              <w:t xml:space="preserve"> </w:t>
             </w:r>
             <w:r>
               <w:rPr>
@@ -460,15 +468,7 @@
                 <w:sz w:val="20"/>
                 <w:szCs w:val="20"/>
               </w:rPr>
-              <w:t xml:space="preserve">that </w:t>
-            </w:r>
-            <w:r>
-              <w:rPr>
-                <w:rFonts w:ascii="Calibri" w:hAnsi="Calibri" w:cs="Calibri"/>
-                <w:sz w:val="20"/>
-                <w:szCs w:val="20"/>
-              </w:rPr>
-              <w:t>facilitates</w:t>
+              <w:t>used by data scientists for</w:t>
             </w:r>
             <w:r>
               <w:rPr>
@@ -517,14 +517,6 @@
                 <w:szCs w:val="20"/>
               </w:rPr>
               <w:t xml:space="preserve"> and deployment of Machine Learning (ML) models at Amex.</w:t>
-            </w:r>
-            <w:r>
-              <w:rPr>
-                <w:rFonts w:ascii="Calibri" w:hAnsi="Calibri" w:cs="Calibri"/>
-                <w:sz w:val="20"/>
-                <w:szCs w:val="20"/>
-              </w:rPr>
-              <w:t xml:space="preserve"> </w:t>
             </w:r>
           </w:p>
           <w:p>
@@ -554,15 +546,23 @@
                 <w:sz w:val="20"/>
                 <w:szCs w:val="20"/>
               </w:rPr>
-              <w:t>B</w:t>
-            </w:r>
-            <w:r>
-              <w:rPr>
-                <w:rFonts w:ascii="Calibri" w:hAnsi="Calibri" w:cs="Calibri"/>
-                <w:sz w:val="20"/>
-                <w:szCs w:val="20"/>
-              </w:rPr>
-              <w:t>uilt</w:t>
+              <w:t>Led</w:t>
+            </w:r>
+            <w:r>
+              <w:rPr>
+                <w:rFonts w:ascii="Calibri" w:hAnsi="Calibri" w:cs="Calibri"/>
+                <w:sz w:val="20"/>
+                <w:szCs w:val="20"/>
+              </w:rPr>
+              <w:t xml:space="preserve"> a team to build</w:t>
+            </w:r>
+            <w:r>
+              <w:rPr>
+                <w:rFonts w:ascii="Calibri" w:hAnsi="Calibri" w:cs="Calibri"/>
+                <w:sz w:val="20"/>
+                <w:szCs w:val="20"/>
+              </w:rPr>
+              <w:t xml:space="preserve"> and own</w:t>
             </w:r>
             <w:r>
               <w:rPr>
@@ -578,14 +578,6 @@
                 <w:sz w:val="20"/>
                 <w:szCs w:val="20"/>
               </w:rPr>
-              <w:t xml:space="preserve">and took ownership of </w:t>
-            </w:r>
-            <w:r>
-              <w:rPr>
-                <w:rFonts w:ascii="Calibri" w:hAnsi="Calibri" w:cs="Calibri"/>
-                <w:sz w:val="20"/>
-                <w:szCs w:val="20"/>
-              </w:rPr>
               <w:t xml:space="preserve">a </w:t>
             </w:r>
             <w:r>
@@ -722,7 +714,7 @@
                 <w:sz w:val="20"/>
                 <w:szCs w:val="20"/>
               </w:rPr>
-              <w:t>pre-tax income (PTI) benefit of over $50 million in 2023.</w:t>
+              <w:t>pre-tax income benefit of over $50 million in 2023.</w:t>
             </w:r>
           </w:p>
           <w:p>
@@ -750,7 +742,7 @@
                 <w:sz w:val="20"/>
                 <w:szCs w:val="20"/>
               </w:rPr>
-              <w:t>Led the tech revamp for the</w:t>
+              <w:t>Participated in</w:t>
             </w:r>
             <w:r>
               <w:rPr>
@@ -766,31 +758,15 @@
                 <w:sz w:val="20"/>
                 <w:szCs w:val="20"/>
               </w:rPr>
-              <w:t>application’s</w:t>
-            </w:r>
-            <w:r>
-              <w:rPr>
-                <w:rFonts w:ascii="Calibri" w:hAnsi="Calibri" w:cs="Calibri"/>
-                <w:sz w:val="20"/>
-                <w:szCs w:val="20"/>
-              </w:rPr>
-              <w:t xml:space="preserve"> monolithic codebase to service-oriented architecture </w:t>
-            </w:r>
-            <w:r>
-              <w:rPr>
-                <w:rFonts w:ascii="Calibri" w:hAnsi="Calibri" w:cs="Calibri"/>
-                <w:sz w:val="20"/>
-                <w:szCs w:val="20"/>
-              </w:rPr>
-              <w:t xml:space="preserve">for better </w:t>
-            </w:r>
-            <w:r>
-              <w:rPr>
-                <w:rFonts w:ascii="Calibri" w:hAnsi="Calibri" w:cs="Calibri"/>
-                <w:sz w:val="20"/>
-                <w:szCs w:val="20"/>
-              </w:rPr>
-              <w:t>maintainability.</w:t>
+              <w:t>tech revamp for the application’s monolithic codebase to service-oriented architecture for maintainability</w:t>
+            </w:r>
+            <w:r>
+              <w:rPr>
+                <w:rFonts w:ascii="Calibri" w:hAnsi="Calibri" w:cs="Calibri"/>
+                <w:sz w:val="20"/>
+                <w:szCs w:val="20"/>
+              </w:rPr>
+              <w:t>.</w:t>
             </w:r>
           </w:p>
           <w:bookmarkEnd w:id="7"/>
@@ -892,15 +868,31 @@
                 <w:sz w:val="20"/>
                 <w:szCs w:val="20"/>
               </w:rPr>
-              <w:t>Managed a team of seven colleagues</w:t>
-            </w:r>
-            <w:r>
-              <w:rPr>
-                <w:rFonts w:ascii="Calibri" w:hAnsi="Calibri" w:cs="Calibri"/>
-                <w:sz w:val="20"/>
-                <w:szCs w:val="20"/>
-              </w:rPr>
-              <w:t xml:space="preserve"> to build </w:t>
+              <w:t>Mentored</w:t>
+            </w:r>
+            <w:r>
+              <w:rPr>
+                <w:rFonts w:ascii="Calibri" w:hAnsi="Calibri" w:cs="Calibri"/>
+                <w:sz w:val="20"/>
+                <w:szCs w:val="20"/>
+              </w:rPr>
+              <w:t xml:space="preserve"> seven colleagues</w:t>
+            </w:r>
+            <w:r>
+              <w:rPr>
+                <w:rFonts w:ascii="Calibri" w:hAnsi="Calibri" w:cs="Calibri"/>
+                <w:sz w:val="20"/>
+                <w:szCs w:val="20"/>
+              </w:rPr>
+              <w:t xml:space="preserve"> </w:t>
+            </w:r>
+            <w:r>
+              <w:rPr>
+                <w:rFonts w:ascii="Calibri" w:hAnsi="Calibri" w:cs="Calibri"/>
+                <w:sz w:val="20"/>
+                <w:szCs w:val="20"/>
+              </w:rPr>
+              <w:t xml:space="preserve">to build </w:t>
             </w:r>
             <w:r>
               <w:rPr>
@@ -940,7 +932,39 @@
                 <w:sz w:val="20"/>
                 <w:szCs w:val="20"/>
               </w:rPr>
-              <w:t>, aiding the Decision Science teams in developing and upgrading the ML models more efficiently.</w:t>
+              <w:t xml:space="preserve">, aiding the </w:t>
+            </w:r>
+            <w:r>
+              <w:rPr>
+                <w:rFonts w:ascii="Calibri" w:hAnsi="Calibri" w:cs="Calibri"/>
+                <w:sz w:val="20"/>
+                <w:szCs w:val="20"/>
+              </w:rPr>
+              <w:t>d</w:t>
+            </w:r>
+            <w:r>
+              <w:rPr>
+                <w:rFonts w:ascii="Calibri" w:hAnsi="Calibri" w:cs="Calibri"/>
+                <w:sz w:val="20"/>
+                <w:szCs w:val="20"/>
+              </w:rPr>
+              <w:t xml:space="preserve">ecision </w:t>
+            </w:r>
+            <w:r>
+              <w:rPr>
+                <w:rFonts w:ascii="Calibri" w:hAnsi="Calibri" w:cs="Calibri"/>
+                <w:sz w:val="20"/>
+                <w:szCs w:val="20"/>
+              </w:rPr>
+              <w:t>s</w:t>
+            </w:r>
+            <w:r>
+              <w:rPr>
+                <w:rFonts w:ascii="Calibri" w:hAnsi="Calibri" w:cs="Calibri"/>
+                <w:sz w:val="20"/>
+                <w:szCs w:val="20"/>
+              </w:rPr>
+              <w:t>cience teams in developing and upgrading the ML models more efficiently.</w:t>
             </w:r>
             <w:r>
               <w:rPr>
@@ -1094,6 +1118,28 @@
                 <w:szCs w:val="20"/>
               </w:rPr>
               <w:t>Intern</w:t>
+            </w:r>
+            <w:r>
+              <w:rPr>
+                <w:rFonts w:ascii="Calibri" w:hAnsi="Calibri" w:cs="Calibri"/>
+                <w:b/>
+                <w:i/>
+                <w:iCs/>
+                <w:sz w:val="20"/>
+                <w:szCs w:val="20"/>
+              </w:rPr>
+              <w:t xml:space="preserve">, Product </w:t>
+            </w:r>
+            <w:r>
+              <w:rPr>
+                <w:rFonts w:ascii="Calibri" w:hAnsi="Calibri" w:cs="Calibri"/>
+                <w:b/>
+                <w:i/>
+                <w:iCs/>
+                <w:sz w:val="20"/>
+                <w:szCs w:val="20"/>
+              </w:rPr>
+              <w:t>Development</w:t>
             </w:r>
           </w:p>
         </w:tc>
@@ -1189,7 +1235,23 @@
                 <w:sz w:val="20"/>
                 <w:szCs w:val="20"/>
               </w:rPr>
-              <w:t>Programmed six manual processes into end-to-end automated pipelines using Selenium, Pandas, Requests, and Flask.</w:t>
+              <w:t>Programmed six manual processes into end-to-end automated pipelines using Selenium</w:t>
+            </w:r>
+            <w:r>
+              <w:rPr>
+                <w:rFonts w:ascii="Calibri" w:hAnsi="Calibri" w:cs="Calibri"/>
+                <w:sz w:val="20"/>
+                <w:szCs w:val="20"/>
+              </w:rPr>
+              <w:t xml:space="preserve"> and the Pandas library</w:t>
+            </w:r>
+            <w:r>
+              <w:rPr>
+                <w:rFonts w:ascii="Calibri" w:hAnsi="Calibri" w:cs="Calibri"/>
+                <w:sz w:val="20"/>
+                <w:szCs w:val="20"/>
+              </w:rPr>
+              <w:t>.</w:t>
             </w:r>
           </w:p>
           <w:bookmarkEnd w:id="10"/>
@@ -1262,7 +1324,7 @@
                 <w:sz w:val="20"/>
                 <w:szCs w:val="20"/>
               </w:rPr>
-              <w:t>iOS Develop</w:t>
+              <w:t>Intern, iOS</w:t>
             </w:r>
             <w:r>
               <w:rPr>
@@ -1273,7 +1335,7 @@
                 <w:sz w:val="20"/>
                 <w:szCs w:val="20"/>
               </w:rPr>
-              <w:t xml:space="preserve">ment </w:t>
+              <w:t xml:space="preserve"> Develop</w:t>
             </w:r>
             <w:r>
               <w:rPr>
@@ -1284,7 +1346,7 @@
                 <w:sz w:val="20"/>
                 <w:szCs w:val="20"/>
               </w:rPr>
-              <w:t>Intern</w:t>
+              <w:t>ment</w:t>
             </w:r>
           </w:p>
         </w:tc>
@@ -1390,7 +1452,23 @@
                 <w:sz w:val="20"/>
                 <w:szCs w:val="20"/>
               </w:rPr>
-              <w:t xml:space="preserve">Augmented Reality Home Planner: Used Apple ARKit to develop an </w:t>
+              <w:t xml:space="preserve">Augmented Reality Home Planner: Used Apple ARKit to </w:t>
+            </w:r>
+            <w:r>
+              <w:rPr>
+                <w:rFonts w:ascii="Calibri" w:hAnsi="Calibri" w:cs="Calibri"/>
+                <w:sz w:val="20"/>
+                <w:szCs w:val="20"/>
+              </w:rPr>
+              <w:t>assist in the development</w:t>
+            </w:r>
+            <w:r>
+              <w:rPr>
+                <w:rFonts w:ascii="Calibri" w:hAnsi="Calibri" w:cs="Calibri"/>
+                <w:sz w:val="20"/>
+                <w:szCs w:val="20"/>
+              </w:rPr>
+              <w:t xml:space="preserve"> an </w:t>
             </w:r>
             <w:r>
               <w:rPr>
@@ -3041,6 +3119,155 @@
     </w:lvl>
   </w:abstractNum>
   <w:abstractNum w:abstractNumId="1" w15:restartNumberingAfterBreak="0">
+    <w:nsid w:val="0EFC0313"/>
+    <w:multiLevelType w:val="multilevel"/>
+    <w:tmpl w:val="2C040166"/>
+    <w:lvl w:ilvl="0">
+      <w:start w:val="1"/>
+      <w:numFmt w:val="bullet"/>
+      <w:lvlText w:val=""/>
+      <w:lvlJc w:val="left"/>
+      <w:pPr>
+        <w:tabs>
+          <w:tab w:val="num" w:pos="720"/>
+        </w:tabs>
+        <w:ind w:left="720" w:hanging="360"/>
+      </w:pPr>
+      <w:rPr>
+        <w:rFonts w:ascii="Symbol" w:hAnsi="Symbol" w:hint="default"/>
+        <w:sz w:val="20"/>
+      </w:rPr>
+    </w:lvl>
+    <w:lvl w:ilvl="1" w:tentative="1">
+      <w:start w:val="1"/>
+      <w:numFmt w:val="bullet"/>
+      <w:lvlText w:val=""/>
+      <w:lvlJc w:val="left"/>
+      <w:pPr>
+        <w:tabs>
+          <w:tab w:val="num" w:pos="1440"/>
+        </w:tabs>
+        <w:ind w:left="1440" w:hanging="360"/>
+      </w:pPr>
+      <w:rPr>
+        <w:rFonts w:ascii="Symbol" w:hAnsi="Symbol" w:hint="default"/>
+        <w:sz w:val="20"/>
+      </w:rPr>
+    </w:lvl>
+    <w:lvl w:ilvl="2" w:tentative="1">
+      <w:start w:val="1"/>
+      <w:numFmt w:val="bullet"/>
+      <w:lvlText w:val=""/>
+      <w:lvlJc w:val="left"/>
+      <w:pPr>
+        <w:tabs>
+          <w:tab w:val="num" w:pos="2160"/>
+        </w:tabs>
+        <w:ind w:left="2160" w:hanging="360"/>
+      </w:pPr>
+      <w:rPr>
+        <w:rFonts w:ascii="Symbol" w:hAnsi="Symbol" w:hint="default"/>
+        <w:sz w:val="20"/>
+      </w:rPr>
+    </w:lvl>
+    <w:lvl w:ilvl="3" w:tentative="1">
+      <w:start w:val="1"/>
+      <w:numFmt w:val="bullet"/>
+      <w:lvlText w:val=""/>
+      <w:lvlJc w:val="left"/>
+      <w:pPr>
+        <w:tabs>
+          <w:tab w:val="num" w:pos="2880"/>
+        </w:tabs>
+        <w:ind w:left="2880" w:hanging="360"/>
+      </w:pPr>
+      <w:rPr>
+        <w:rFonts w:ascii="Symbol" w:hAnsi="Symbol" w:hint="default"/>
+        <w:sz w:val="20"/>
+      </w:rPr>
+    </w:lvl>
+    <w:lvl w:ilvl="4" w:tentative="1">
+      <w:start w:val="1"/>
+      <w:numFmt w:val="bullet"/>
+      <w:lvlText w:val=""/>
+      <w:lvlJc w:val="left"/>
+      <w:pPr>
+        <w:tabs>
+          <w:tab w:val="num" w:pos="3600"/>
+        </w:tabs>
+        <w:ind w:left="3600" w:hanging="360"/>
+      </w:pPr>
+      <w:rPr>
+        <w:rFonts w:ascii="Symbol" w:hAnsi="Symbol" w:hint="default"/>
+        <w:sz w:val="20"/>
+      </w:rPr>
+    </w:lvl>
+    <w:lvl w:ilvl="5" w:tentative="1">
+      <w:start w:val="1"/>
+      <w:numFmt w:val="bullet"/>
+      <w:lvlText w:val=""/>
+      <w:lvlJc w:val="left"/>
+      <w:pPr>
+        <w:tabs>
+          <w:tab w:val="num" w:pos="4320"/>
+        </w:tabs>
+        <w:ind w:left="4320" w:hanging="360"/>
+      </w:pPr>
+      <w:rPr>
+        <w:rFonts w:ascii="Symbol" w:hAnsi="Symbol" w:hint="default"/>
+        <w:sz w:val="20"/>
+      </w:rPr>
+    </w:lvl>
+    <w:lvl w:ilvl="6" w:tentative="1">
+      <w:start w:val="1"/>
+      <w:numFmt w:val="bullet"/>
+      <w:lvlText w:val=""/>
+      <w:lvlJc w:val="left"/>
+      <w:pPr>
+        <w:tabs>
+          <w:tab w:val="num" w:pos="5040"/>
+        </w:tabs>
+        <w:ind w:left="5040" w:hanging="360"/>
+      </w:pPr>
+      <w:rPr>
+        <w:rFonts w:ascii="Symbol" w:hAnsi="Symbol" w:hint="default"/>
+        <w:sz w:val="20"/>
+      </w:rPr>
+    </w:lvl>
+    <w:lvl w:ilvl="7" w:tentative="1">
+      <w:start w:val="1"/>
+      <w:numFmt w:val="bullet"/>
+      <w:lvlText w:val=""/>
+      <w:lvlJc w:val="left"/>
+      <w:pPr>
+        <w:tabs>
+          <w:tab w:val="num" w:pos="5760"/>
+        </w:tabs>
+        <w:ind w:left="5760" w:hanging="360"/>
+      </w:pPr>
+      <w:rPr>
+        <w:rFonts w:ascii="Symbol" w:hAnsi="Symbol" w:hint="default"/>
+        <w:sz w:val="20"/>
+      </w:rPr>
+    </w:lvl>
+    <w:lvl w:ilvl="8" w:tentative="1">
+      <w:start w:val="1"/>
+      <w:numFmt w:val="bullet"/>
+      <w:lvlText w:val=""/>
+      <w:lvlJc w:val="left"/>
+      <w:pPr>
+        <w:tabs>
+          <w:tab w:val="num" w:pos="6480"/>
+        </w:tabs>
+        <w:ind w:left="6480" w:hanging="360"/>
+      </w:pPr>
+      <w:rPr>
+        <w:rFonts w:ascii="Symbol" w:hAnsi="Symbol" w:hint="default"/>
+        <w:sz w:val="20"/>
+      </w:rPr>
+    </w:lvl>
+  </w:abstractNum>
+  <w:abstractNum w:abstractNumId="2" w15:restartNumberingAfterBreak="0">
     <w:nsid w:val="20C727DB"/>
     <w:multiLevelType w:val="hybridMultilevel"/>
     <w:tmpl w:val="58C8715E"/>
@@ -3153,7 +3380,7 @@
       </w:rPr>
     </w:lvl>
   </w:abstractNum>
-  <w:abstractNum w:abstractNumId="2" w15:restartNumberingAfterBreak="0">
+  <w:abstractNum w:abstractNumId="3" w15:restartNumberingAfterBreak="0">
     <w:nsid w:val="218D459C"/>
     <w:multiLevelType w:val="hybridMultilevel"/>
     <w:tmpl w:val="1A6E3490"/>
@@ -3266,7 +3493,7 @@
       </w:rPr>
     </w:lvl>
   </w:abstractNum>
-  <w:abstractNum w:abstractNumId="3" w15:restartNumberingAfterBreak="0">
+  <w:abstractNum w:abstractNumId="4" w15:restartNumberingAfterBreak="0">
     <w:nsid w:val="28C36D3A"/>
     <w:multiLevelType w:val="hybridMultilevel"/>
     <w:tmpl w:val="17462E32"/>
@@ -3409,7 +3636,7 @@
       </w:rPr>
     </w:lvl>
   </w:abstractNum>
-  <w:abstractNum w:abstractNumId="4" w15:restartNumberingAfterBreak="0">
+  <w:abstractNum w:abstractNumId="5" w15:restartNumberingAfterBreak="0">
     <w:nsid w:val="2A525042"/>
     <w:multiLevelType w:val="hybridMultilevel"/>
     <w:tmpl w:val="972E6B8C"/>
@@ -3522,7 +3749,7 @@
       </w:rPr>
     </w:lvl>
   </w:abstractNum>
-  <w:abstractNum w:abstractNumId="5" w15:restartNumberingAfterBreak="0">
+  <w:abstractNum w:abstractNumId="6" w15:restartNumberingAfterBreak="0">
     <w:nsid w:val="37E50D79"/>
     <w:multiLevelType w:val="multilevel"/>
     <w:tmpl w:val="0F56C60A"/>
@@ -3671,7 +3898,7 @@
       </w:rPr>
     </w:lvl>
   </w:abstractNum>
-  <w:abstractNum w:abstractNumId="6" w15:restartNumberingAfterBreak="0">
+  <w:abstractNum w:abstractNumId="7" w15:restartNumberingAfterBreak="0">
     <w:nsid w:val="43EE3875"/>
     <w:multiLevelType w:val="hybridMultilevel"/>
     <w:tmpl w:val="1F2409AA"/>
@@ -3814,7 +4041,7 @@
       </w:rPr>
     </w:lvl>
   </w:abstractNum>
-  <w:abstractNum w:abstractNumId="7" w15:restartNumberingAfterBreak="0">
+  <w:abstractNum w:abstractNumId="8" w15:restartNumberingAfterBreak="0">
     <w:nsid w:val="44E36D24"/>
     <w:multiLevelType w:val="multilevel"/>
     <w:tmpl w:val="C574A1D4"/>
@@ -3957,7 +4184,7 @@
       </w:rPr>
     </w:lvl>
   </w:abstractNum>
-  <w:abstractNum w:abstractNumId="8" w15:restartNumberingAfterBreak="0">
+  <w:abstractNum w:abstractNumId="9" w15:restartNumberingAfterBreak="0">
     <w:nsid w:val="4EA55D92"/>
     <w:multiLevelType w:val="hybridMultilevel"/>
     <w:tmpl w:val="40F8EF08"/>
@@ -4101,7 +4328,7 @@
       </w:rPr>
     </w:lvl>
   </w:abstractNum>
-  <w:abstractNum w:abstractNumId="9" w15:restartNumberingAfterBreak="0">
+  <w:abstractNum w:abstractNumId="10" w15:restartNumberingAfterBreak="0">
     <w:nsid w:val="59D62AF9"/>
     <w:multiLevelType w:val="hybridMultilevel"/>
     <w:tmpl w:val="B0DC66D8"/>
@@ -4214,7 +4441,7 @@
       </w:rPr>
     </w:lvl>
   </w:abstractNum>
-  <w:abstractNum w:abstractNumId="10" w15:restartNumberingAfterBreak="0">
+  <w:abstractNum w:abstractNumId="11" w15:restartNumberingAfterBreak="0">
     <w:nsid w:val="602376DE"/>
     <w:multiLevelType w:val="multilevel"/>
     <w:tmpl w:val="1F2409AA"/>
@@ -4357,7 +4584,7 @@
       </w:rPr>
     </w:lvl>
   </w:abstractNum>
-  <w:abstractNum w:abstractNumId="11" w15:restartNumberingAfterBreak="0">
+  <w:abstractNum w:abstractNumId="12" w15:restartNumberingAfterBreak="0">
     <w:nsid w:val="664F2126"/>
     <w:multiLevelType w:val="hybridMultilevel"/>
     <w:tmpl w:val="DE1EB572"/>
@@ -4470,7 +4697,7 @@
       </w:rPr>
     </w:lvl>
   </w:abstractNum>
-  <w:abstractNum w:abstractNumId="12" w15:restartNumberingAfterBreak="0">
+  <w:abstractNum w:abstractNumId="13" w15:restartNumberingAfterBreak="0">
     <w:nsid w:val="66BE4B9C"/>
     <w:multiLevelType w:val="hybridMultilevel"/>
     <w:tmpl w:val="C574A1D4"/>
@@ -4613,7 +4840,7 @@
       </w:rPr>
     </w:lvl>
   </w:abstractNum>
-  <w:abstractNum w:abstractNumId="13" w15:restartNumberingAfterBreak="0">
+  <w:abstractNum w:abstractNumId="14" w15:restartNumberingAfterBreak="0">
     <w:nsid w:val="6C8E594D"/>
     <w:multiLevelType w:val="hybridMultilevel"/>
     <w:tmpl w:val="4FF2909A"/>
@@ -4756,7 +4983,7 @@
       </w:rPr>
     </w:lvl>
   </w:abstractNum>
-  <w:abstractNum w:abstractNumId="14" w15:restartNumberingAfterBreak="0">
+  <w:abstractNum w:abstractNumId="15" w15:restartNumberingAfterBreak="0">
     <w:nsid w:val="73054A62"/>
     <w:multiLevelType w:val="hybridMultilevel"/>
     <w:tmpl w:val="ABB00A48"/>
@@ -4896,7 +5123,7 @@
       </w:rPr>
     </w:lvl>
   </w:abstractNum>
-  <w:abstractNum w:abstractNumId="15" w15:restartNumberingAfterBreak="0">
+  <w:abstractNum w:abstractNumId="16" w15:restartNumberingAfterBreak="0">
     <w:nsid w:val="7D8828E0"/>
     <w:multiLevelType w:val="hybridMultilevel"/>
     <w:tmpl w:val="B68CC4E6"/>
@@ -5040,52 +5267,55 @@
     </w:lvl>
   </w:abstractNum>
   <w:num w:numId="1" w16cid:durableId="174345982">
-    <w:abstractNumId w:val="6"/>
+    <w:abstractNumId w:val="7"/>
   </w:num>
   <w:num w:numId="2" w16cid:durableId="576591569">
-    <w:abstractNumId w:val="3"/>
+    <w:abstractNumId w:val="4"/>
   </w:num>
   <w:num w:numId="3" w16cid:durableId="1964455288">
-    <w:abstractNumId w:val="8"/>
+    <w:abstractNumId w:val="9"/>
   </w:num>
   <w:num w:numId="4" w16cid:durableId="1809740008">
+    <w:abstractNumId w:val="16"/>
+  </w:num>
+  <w:num w:numId="5" w16cid:durableId="1663850123">
+    <w:abstractNumId w:val="13"/>
+  </w:num>
+  <w:num w:numId="6" w16cid:durableId="1726873998">
     <w:abstractNumId w:val="15"/>
   </w:num>
-  <w:num w:numId="5" w16cid:durableId="1663850123">
-    <w:abstractNumId w:val="12"/>
-  </w:num>
-  <w:num w:numId="6" w16cid:durableId="1726873998">
+  <w:num w:numId="7" w16cid:durableId="1737628104">
     <w:abstractNumId w:val="14"/>
   </w:num>
-  <w:num w:numId="7" w16cid:durableId="1737628104">
-    <w:abstractNumId w:val="13"/>
-  </w:num>
   <w:num w:numId="8" w16cid:durableId="824591776">
-    <w:abstractNumId w:val="10"/>
+    <w:abstractNumId w:val="11"/>
   </w:num>
   <w:num w:numId="9" w16cid:durableId="1081562466">
-    <w:abstractNumId w:val="7"/>
+    <w:abstractNumId w:val="8"/>
   </w:num>
   <w:num w:numId="10" w16cid:durableId="666596524">
     <w:abstractNumId w:val="0"/>
   </w:num>
   <w:num w:numId="11" w16cid:durableId="910847414">
-    <w:abstractNumId w:val="11"/>
+    <w:abstractNumId w:val="12"/>
   </w:num>
   <w:num w:numId="12" w16cid:durableId="1205286574">
-    <w:abstractNumId w:val="4"/>
+    <w:abstractNumId w:val="5"/>
   </w:num>
   <w:num w:numId="13" w16cid:durableId="469830577">
-    <w:abstractNumId w:val="1"/>
+    <w:abstractNumId w:val="2"/>
   </w:num>
   <w:num w:numId="14" w16cid:durableId="219052901">
-    <w:abstractNumId w:val="5"/>
+    <w:abstractNumId w:val="6"/>
   </w:num>
   <w:num w:numId="15" w16cid:durableId="942687552">
-    <w:abstractNumId w:val="2"/>
+    <w:abstractNumId w:val="3"/>
   </w:num>
   <w:num w:numId="16" w16cid:durableId="329216700">
-    <w:abstractNumId w:val="9"/>
+    <w:abstractNumId w:val="10"/>
+  </w:num>
+  <w:num w:numId="17" w16cid:durableId="1901332060">
+    <w:abstractNumId w:val="1"/>
   </w:num>
 </w:numbering>
 </file>
@@ -5504,7 +5734,6 @@
   <w:style w:type="character" w:default="1" w:styleId="DefaultParagraphFont">
     <w:name w:val="Default Paragraph Font"/>
     <w:uiPriority w:val="1"/>
-    <w:semiHidden/>
     <w:unhideWhenUsed/>
   </w:style>
   <w:style w:type="table" w:default="1" w:styleId="TableNormal">

</xml_diff>

<commit_message>
Update eduction, minor improvement in recent experience
</commit_message>
<xml_diff>
--- a/resume/dev/Harshit_Jindal_SDE.docx
+++ b/resume/dev/Harshit_Jindal_SDE.docx
@@ -758,39 +758,23 @@
                 <w:sz w:val="20"/>
                 <w:szCs w:val="20"/>
               </w:rPr>
-              <w:t>Worked</w:t>
-            </w:r>
-            <w:r>
-              <w:rPr>
-                <w:rFonts w:ascii="Calibri" w:hAnsi="Calibri" w:cs="Calibri"/>
-                <w:sz w:val="20"/>
-                <w:szCs w:val="20"/>
-              </w:rPr>
-              <w:t xml:space="preserve"> to </w:t>
-            </w:r>
-            <w:r>
-              <w:rPr>
-                <w:rFonts w:ascii="Calibri" w:hAnsi="Calibri" w:cs="Calibri"/>
-                <w:sz w:val="20"/>
-                <w:szCs w:val="20"/>
-              </w:rPr>
-              <w:t>refactor</w:t>
-            </w:r>
-            <w:r>
-              <w:rPr>
-                <w:rFonts w:ascii="Calibri" w:hAnsi="Calibri" w:cs="Calibri"/>
-                <w:sz w:val="20"/>
-                <w:szCs w:val="20"/>
-              </w:rPr>
-              <w:t xml:space="preserve"> the monolith</w:t>
-            </w:r>
-            <w:r>
-              <w:rPr>
-                <w:rFonts w:ascii="Calibri" w:hAnsi="Calibri" w:cs="Calibri"/>
-                <w:sz w:val="20"/>
-                <w:szCs w:val="20"/>
-              </w:rPr>
-              <w:t>ic application</w:t>
+              <w:t>R</w:t>
+            </w:r>
+            <w:r>
+              <w:rPr>
+                <w:rFonts w:ascii="Calibri" w:hAnsi="Calibri" w:cs="Calibri"/>
+                <w:sz w:val="20"/>
+                <w:szCs w:val="20"/>
+              </w:rPr>
+              <w:t>efactor</w:t>
+            </w:r>
+            <w:r>
+              <w:rPr>
+                <w:rFonts w:ascii="Calibri" w:hAnsi="Calibri" w:cs="Calibri"/>
+                <w:sz w:val="20"/>
+                <w:szCs w:val="20"/>
+              </w:rPr>
+              <w:t>ed</w:t>
             </w:r>
             <w:r>
               <w:rPr>
@@ -806,6 +790,62 @@
                 <w:sz w:val="20"/>
                 <w:szCs w:val="20"/>
               </w:rPr>
+              <w:t>the</w:t>
+            </w:r>
+            <w:r>
+              <w:rPr>
+                <w:rFonts w:ascii="Calibri" w:hAnsi="Calibri" w:cs="Calibri"/>
+                <w:sz w:val="20"/>
+                <w:szCs w:val="20"/>
+              </w:rPr>
+              <w:t xml:space="preserve"> </w:t>
+            </w:r>
+            <w:r>
+              <w:rPr>
+                <w:rFonts w:ascii="Calibri" w:hAnsi="Calibri" w:cs="Calibri"/>
+                <w:sz w:val="20"/>
+                <w:szCs w:val="20"/>
+              </w:rPr>
+              <w:t>monolith</w:t>
+            </w:r>
+            <w:r>
+              <w:rPr>
+                <w:rFonts w:ascii="Calibri" w:hAnsi="Calibri" w:cs="Calibri"/>
+                <w:sz w:val="20"/>
+                <w:szCs w:val="20"/>
+              </w:rPr>
+              <w:t>ic</w:t>
+            </w:r>
+            <w:r>
+              <w:rPr>
+                <w:rFonts w:ascii="Calibri" w:hAnsi="Calibri" w:cs="Calibri"/>
+                <w:sz w:val="20"/>
+                <w:szCs w:val="20"/>
+              </w:rPr>
+              <w:t xml:space="preserve"> app</w:t>
+            </w:r>
+            <w:r>
+              <w:rPr>
+                <w:rFonts w:ascii="Calibri" w:hAnsi="Calibri" w:cs="Calibri"/>
+                <w:sz w:val="20"/>
+                <w:szCs w:val="20"/>
+              </w:rPr>
+              <w:t>lication</w:t>
+            </w:r>
+            <w:r>
+              <w:rPr>
+                <w:rFonts w:ascii="Calibri" w:hAnsi="Calibri" w:cs="Calibri"/>
+                <w:sz w:val="20"/>
+                <w:szCs w:val="20"/>
+              </w:rPr>
+              <w:t xml:space="preserve"> </w:t>
+            </w:r>
+            <w:r>
+              <w:rPr>
+                <w:rFonts w:ascii="Calibri" w:hAnsi="Calibri" w:cs="Calibri"/>
+                <w:sz w:val="20"/>
+                <w:szCs w:val="20"/>
+              </w:rPr>
               <w:t>into</w:t>
             </w:r>
             <w:r>
@@ -814,23 +854,71 @@
                 <w:sz w:val="20"/>
                 <w:szCs w:val="20"/>
               </w:rPr>
-              <w:t xml:space="preserve"> individual services </w:t>
-            </w:r>
-            <w:r>
-              <w:rPr>
-                <w:rFonts w:ascii="Calibri" w:hAnsi="Calibri" w:cs="Calibri"/>
-                <w:sz w:val="20"/>
-                <w:szCs w:val="20"/>
-              </w:rPr>
-              <w:t>to reduce code complexity</w:t>
-            </w:r>
-            <w:r>
-              <w:rPr>
-                <w:rFonts w:ascii="Calibri" w:hAnsi="Calibri" w:cs="Calibri"/>
-                <w:sz w:val="20"/>
-                <w:szCs w:val="20"/>
-              </w:rPr>
-              <w:t xml:space="preserve"> and for maintainability</w:t>
+              <w:t xml:space="preserve"> individual services</w:t>
+            </w:r>
+            <w:r>
+              <w:rPr>
+                <w:rFonts w:ascii="Calibri" w:hAnsi="Calibri" w:cs="Calibri"/>
+                <w:sz w:val="20"/>
+                <w:szCs w:val="20"/>
+              </w:rPr>
+              <w:t xml:space="preserve">, </w:t>
+            </w:r>
+            <w:r>
+              <w:rPr>
+                <w:rFonts w:ascii="Calibri" w:hAnsi="Calibri" w:cs="Calibri"/>
+                <w:sz w:val="20"/>
+                <w:szCs w:val="20"/>
+              </w:rPr>
+              <w:t>reduc</w:t>
+            </w:r>
+            <w:r>
+              <w:rPr>
+                <w:rFonts w:ascii="Calibri" w:hAnsi="Calibri" w:cs="Calibri"/>
+                <w:sz w:val="20"/>
+                <w:szCs w:val="20"/>
+              </w:rPr>
+              <w:t>ing</w:t>
+            </w:r>
+            <w:r>
+              <w:rPr>
+                <w:rFonts w:ascii="Calibri" w:hAnsi="Calibri" w:cs="Calibri"/>
+                <w:sz w:val="20"/>
+                <w:szCs w:val="20"/>
+              </w:rPr>
+              <w:t xml:space="preserve"> code complexity</w:t>
+            </w:r>
+            <w:r>
+              <w:rPr>
+                <w:rFonts w:ascii="Calibri" w:hAnsi="Calibri" w:cs="Calibri"/>
+                <w:sz w:val="20"/>
+                <w:szCs w:val="20"/>
+              </w:rPr>
+              <w:t xml:space="preserve"> and </w:t>
+            </w:r>
+            <w:r>
+              <w:rPr>
+                <w:rFonts w:ascii="Calibri" w:hAnsi="Calibri" w:cs="Calibri"/>
+                <w:sz w:val="20"/>
+                <w:szCs w:val="20"/>
+              </w:rPr>
+              <w:t>improv</w:t>
+            </w:r>
+            <w:r>
+              <w:rPr>
+                <w:rFonts w:ascii="Calibri" w:hAnsi="Calibri" w:cs="Calibri"/>
+                <w:sz w:val="20"/>
+                <w:szCs w:val="20"/>
+              </w:rPr>
+              <w:t xml:space="preserve">ing </w:t>
+            </w:r>
+            <w:r>
+              <w:rPr>
+                <w:rFonts w:ascii="Calibri" w:hAnsi="Calibri" w:cs="Calibri"/>
+                <w:sz w:val="20"/>
+                <w:szCs w:val="20"/>
+              </w:rPr>
+              <w:t>maintainability</w:t>
             </w:r>
             <w:r>
               <w:rPr>
@@ -1350,7 +1438,39 @@
                 <w:sz w:val="20"/>
                 <w:szCs w:val="20"/>
               </w:rPr>
-              <w:t>Coded 100+ rules for the Dynamic Authorization of Credit (DAC) system that utilize scores from in-house ML models to take the final decisions.</w:t>
+              <w:t>Coded 100+ rules for the Dynamic Authorization system</w:t>
+            </w:r>
+            <w:r>
+              <w:rPr>
+                <w:rFonts w:ascii="Calibri" w:hAnsi="Calibri" w:cs="Calibri"/>
+                <w:sz w:val="20"/>
+                <w:szCs w:val="20"/>
+              </w:rPr>
+              <w:t xml:space="preserve"> responsible for </w:t>
+            </w:r>
+            <w:r>
+              <w:rPr>
+                <w:rFonts w:ascii="Calibri" w:hAnsi="Calibri" w:cs="Calibri"/>
+                <w:sz w:val="20"/>
+                <w:szCs w:val="20"/>
+              </w:rPr>
+              <w:t xml:space="preserve">the </w:t>
+            </w:r>
+            <w:r>
+              <w:rPr>
+                <w:rFonts w:ascii="Calibri" w:hAnsi="Calibri" w:cs="Calibri"/>
+                <w:sz w:val="20"/>
+                <w:szCs w:val="20"/>
+              </w:rPr>
+              <w:t>credit and fraud decisioning</w:t>
+            </w:r>
+            <w:r>
+              <w:rPr>
+                <w:rFonts w:ascii="Calibri" w:hAnsi="Calibri" w:cs="Calibri"/>
+                <w:sz w:val="20"/>
+                <w:szCs w:val="20"/>
+              </w:rPr>
+              <w:t xml:space="preserve"> basis ML scores.</w:t>
             </w:r>
           </w:p>
           <w:p>
@@ -1886,7 +2006,124 @@
               </w:rPr>
               <w:t>2/10</w:t>
             </w:r>
+            <w:bookmarkStart w:id="11" w:name="_Hlk158931231"/>
+            <w:r>
+              <w:rPr>
+                <w:rFonts w:ascii="Calibri" w:hAnsi="Calibri" w:cs="Calibri"/>
+                <w:sz w:val="20"/>
+                <w:szCs w:val="20"/>
+              </w:rPr>
+              <w:t>.</w:t>
+            </w:r>
           </w:p>
+          <w:p>
+            <w:pPr>
+              <w:numPr>
+                <w:ilvl w:val="0"/>
+                <w:numId w:val="5"/>
+              </w:numPr>
+              <w:tabs>
+                <w:tab w:val="clear" w:pos="720"/>
+              </w:tabs>
+              <w:ind w:left="252" w:hanging="180"/>
+              <w:rPr>
+                <w:rFonts w:ascii="Calibri" w:hAnsi="Calibri" w:cs="Calibri"/>
+                <w:sz w:val="20"/>
+                <w:szCs w:val="20"/>
+              </w:rPr>
+            </w:pPr>
+            <w:r>
+              <w:rPr>
+                <w:rFonts w:ascii="Calibri" w:hAnsi="Calibri" w:cs="Calibri"/>
+                <w:sz w:val="20"/>
+                <w:szCs w:val="20"/>
+              </w:rPr>
+              <w:t xml:space="preserve">Coursework: Software Architecture, </w:t>
+            </w:r>
+            <w:r>
+              <w:rPr>
+                <w:rFonts w:ascii="Calibri" w:hAnsi="Calibri" w:cs="Calibri"/>
+                <w:sz w:val="20"/>
+                <w:szCs w:val="20"/>
+              </w:rPr>
+              <w:t>Service</w:t>
+            </w:r>
+            <w:r>
+              <w:rPr>
+                <w:rFonts w:ascii="Calibri" w:hAnsi="Calibri" w:cs="Calibri"/>
+                <w:sz w:val="20"/>
+                <w:szCs w:val="20"/>
+              </w:rPr>
+              <w:t xml:space="preserve"> </w:t>
+            </w:r>
+            <w:r>
+              <w:rPr>
+                <w:rFonts w:ascii="Calibri" w:hAnsi="Calibri" w:cs="Calibri"/>
+                <w:sz w:val="20"/>
+                <w:szCs w:val="20"/>
+              </w:rPr>
+              <w:t xml:space="preserve">Oriented Computing, Cloud Computing, </w:t>
+            </w:r>
+            <w:r>
+              <w:rPr>
+                <w:rFonts w:ascii="Calibri" w:hAnsi="Calibri" w:cs="Calibri"/>
+                <w:sz w:val="20"/>
+                <w:szCs w:val="20"/>
+              </w:rPr>
+              <w:t xml:space="preserve">DevOps, </w:t>
+            </w:r>
+            <w:r>
+              <w:rPr>
+                <w:rFonts w:ascii="Calibri" w:hAnsi="Calibri" w:cs="Calibri"/>
+                <w:sz w:val="20"/>
+                <w:szCs w:val="20"/>
+              </w:rPr>
+              <w:t xml:space="preserve">Secure Software </w:t>
+            </w:r>
+            <w:proofErr w:type="gramStart"/>
+            <w:r>
+              <w:rPr>
+                <w:rFonts w:ascii="Calibri" w:hAnsi="Calibri" w:cs="Calibri"/>
+                <w:sz w:val="20"/>
+                <w:szCs w:val="20"/>
+              </w:rPr>
+              <w:t xml:space="preserve">Engineering, </w:t>
+            </w:r>
+            <w:r>
+              <w:rPr>
+                <w:rFonts w:ascii="Calibri" w:hAnsi="Calibri" w:cs="Calibri"/>
+                <w:sz w:val="20"/>
+                <w:szCs w:val="20"/>
+              </w:rPr>
+              <w:t xml:space="preserve"> </w:t>
+            </w:r>
+            <w:r>
+              <w:rPr>
+                <w:rFonts w:ascii="Calibri" w:hAnsi="Calibri" w:cs="Calibri"/>
+                <w:sz w:val="20"/>
+                <w:szCs w:val="20"/>
+              </w:rPr>
+              <w:t>Software</w:t>
+            </w:r>
+            <w:proofErr w:type="gramEnd"/>
+            <w:r>
+              <w:rPr>
+                <w:rFonts w:ascii="Calibri" w:hAnsi="Calibri" w:cs="Calibri"/>
+                <w:sz w:val="20"/>
+                <w:szCs w:val="20"/>
+              </w:rPr>
+              <w:t xml:space="preserve"> Testing Methodologies, </w:t>
+            </w:r>
+            <w:r>
+              <w:rPr>
+                <w:rFonts w:ascii="Calibri" w:hAnsi="Calibri" w:cs="Calibri"/>
+                <w:sz w:val="20"/>
+                <w:szCs w:val="20"/>
+              </w:rPr>
+              <w:t>Agile Software Processes, Software Product Management</w:t>
+            </w:r>
+          </w:p>
+          <w:bookmarkEnd w:id="11"/>
           <w:p>
             <w:pPr>
               <w:ind w:left="252"/>
@@ -2032,7 +2269,7 @@
                 <w:szCs w:val="20"/>
               </w:rPr>
             </w:pPr>
-            <w:bookmarkStart w:id="11" w:name="_Hlk144192934"/>
+            <w:bookmarkStart w:id="12" w:name="_Hlk144192934"/>
             <w:r>
               <w:rPr>
                 <w:rFonts w:ascii="Calibri" w:hAnsi="Calibri" w:cs="Calibri"/>
@@ -2082,7 +2319,7 @@
               <w:t xml:space="preserve"> (with Honors)</w:t>
             </w:r>
           </w:p>
-          <w:bookmarkEnd w:id="11"/>
+          <w:bookmarkEnd w:id="12"/>
           <w:p>
             <w:pPr>
               <w:ind w:left="252"/>
@@ -2273,26 +2510,6 @@
                 <w:rFonts w:ascii="Calibri" w:hAnsi="Calibri" w:cs="Calibri"/>
               </w:rPr>
               <w:t>Kubernetes</w:t>
-            </w:r>
-          </w:p>
-          <w:p>
-            <w:pPr>
-              <w:pStyle w:val="Achievement"/>
-              <w:rPr>
-                <w:rFonts w:ascii="Calibri" w:hAnsi="Calibri" w:cs="Calibri"/>
-              </w:rPr>
-            </w:pPr>
-            <w:r>
-              <w:rPr>
-                <w:rFonts w:ascii="Calibri" w:hAnsi="Calibri" w:cs="Calibri"/>
-              </w:rPr>
-              <w:t xml:space="preserve">Data Structures &amp; Algorithms, </w:t>
-            </w:r>
-            <w:r>
-              <w:rPr>
-                <w:rFonts w:ascii="Calibri" w:hAnsi="Calibri" w:cs="Calibri"/>
-              </w:rPr>
-              <w:t>Web Development, iOS Development, Machine Learning</w:t>
             </w:r>
           </w:p>
           <w:p>
@@ -2938,6 +3155,7 @@
                 <w:szCs w:val="20"/>
               </w:rPr>
             </w:pPr>
+            <w:bookmarkStart w:id="13" w:name="_Hlk158931507"/>
             <w:r>
               <w:rPr>
                 <w:rFonts w:ascii="Calibri" w:hAnsi="Calibri" w:cs="Calibri"/>
@@ -3008,6 +3226,7 @@
           </w:p>
         </w:tc>
       </w:tr>
+      <w:bookmarkEnd w:id="13"/>
     </w:tbl>
     <w:p>
       <w:pPr>

</xml_diff>

<commit_message>
Update skills, and add gradesheets
</commit_message>
<xml_diff>
--- a/resume/dev/Harshit_Jindal_SDE.docx
+++ b/resume/dev/Harshit_Jindal_SDE.docx
@@ -370,9 +370,9 @@
                 <w:szCs w:val="20"/>
               </w:rPr>
             </w:pPr>
-            <w:bookmarkStart w:id="3" w:name="_Hlk144188629"/>
-            <w:bookmarkStart w:id="4" w:name="_Hlk152520120"/>
-            <w:bookmarkStart w:id="5" w:name="_Hlk152521493"/>
+            <w:bookmarkStart w:id="3" w:name="_Hlk152520120"/>
+            <w:bookmarkStart w:id="4" w:name="_Hlk152521493"/>
+            <w:bookmarkStart w:id="5" w:name="_Hlk144188629"/>
             <w:r>
               <w:rPr>
                 <w:rFonts w:ascii="Calibri" w:hAnsi="Calibri" w:cs="Calibri"/>
@@ -397,7 +397,7 @@
               </w:rPr>
               <w:t xml:space="preserve"> </w:t>
             </w:r>
-            <w:bookmarkEnd w:id="3"/>
+            <w:bookmarkEnd w:id="5"/>
             <w:r>
               <w:rPr>
                 <w:rFonts w:ascii="Calibri" w:hAnsi="Calibri" w:cs="Calibri"/>
@@ -539,7 +539,7 @@
             <w:bookmarkStart w:id="6" w:name="_Hlk152516239"/>
             <w:bookmarkStart w:id="7" w:name="_Hlk152151040"/>
             <w:bookmarkStart w:id="8" w:name="_Hlk152520106"/>
-            <w:bookmarkEnd w:id="4"/>
+            <w:bookmarkEnd w:id="3"/>
             <w:r>
               <w:rPr>
                 <w:rFonts w:ascii="Calibri" w:hAnsi="Calibri" w:cs="Calibri"/>
@@ -1234,7 +1234,7 @@
               <w:t>Promoted from Associate to Sr. Associate in February 2023.</w:t>
             </w:r>
           </w:p>
-          <w:bookmarkEnd w:id="5"/>
+          <w:bookmarkEnd w:id="4"/>
           <w:p>
             <w:pPr>
               <w:ind w:left="252"/>
@@ -2013,6 +2013,30 @@
                 <w:sz w:val="20"/>
                 <w:szCs w:val="20"/>
               </w:rPr>
+              <w:t xml:space="preserve"> (work-integrated </w:t>
+            </w:r>
+            <w:r>
+              <w:rPr>
+                <w:rFonts w:ascii="Calibri" w:hAnsi="Calibri" w:cs="Calibri"/>
+                <w:sz w:val="20"/>
+                <w:szCs w:val="20"/>
+              </w:rPr>
+              <w:t>programme</w:t>
+            </w:r>
+            <w:r>
+              <w:rPr>
+                <w:rFonts w:ascii="Calibri" w:hAnsi="Calibri" w:cs="Calibri"/>
+                <w:sz w:val="20"/>
+                <w:szCs w:val="20"/>
+              </w:rPr>
+              <w:t>)</w:t>
+            </w:r>
+            <w:r>
+              <w:rPr>
+                <w:rFonts w:ascii="Calibri" w:hAnsi="Calibri" w:cs="Calibri"/>
+                <w:sz w:val="20"/>
+                <w:szCs w:val="20"/>
+              </w:rPr>
               <w:t>.</w:t>
             </w:r>
           </w:p>
@@ -2078,16 +2102,7 @@
                 <w:sz w:val="20"/>
                 <w:szCs w:val="20"/>
               </w:rPr>
-              <w:t xml:space="preserve">Secure Software </w:t>
-            </w:r>
-            <w:proofErr w:type="gramStart"/>
-            <w:r>
-              <w:rPr>
-                <w:rFonts w:ascii="Calibri" w:hAnsi="Calibri" w:cs="Calibri"/>
-                <w:sz w:val="20"/>
-                <w:szCs w:val="20"/>
-              </w:rPr>
-              <w:t xml:space="preserve">Engineering, </w:t>
+              <w:t>Secure Software Engineering,</w:t>
             </w:r>
             <w:r>
               <w:rPr>
@@ -2103,16 +2118,7 @@
                 <w:sz w:val="20"/>
                 <w:szCs w:val="20"/>
               </w:rPr>
-              <w:t>Software</w:t>
-            </w:r>
-            <w:proofErr w:type="gramEnd"/>
-            <w:r>
-              <w:rPr>
-                <w:rFonts w:ascii="Calibri" w:hAnsi="Calibri" w:cs="Calibri"/>
-                <w:sz w:val="20"/>
-                <w:szCs w:val="20"/>
-              </w:rPr>
-              <w:t xml:space="preserve"> Testing Methodologies, </w:t>
+              <w:t xml:space="preserve">Software Testing Methodologies, </w:t>
             </w:r>
             <w:r>
               <w:rPr>
@@ -2121,6 +2127,33 @@
                 <w:szCs w:val="20"/>
               </w:rPr>
               <w:t>Agile Software Processes, Software Product Management</w:t>
+            </w:r>
+            <w:r>
+              <w:rPr>
+                <w:rFonts w:ascii="Calibri" w:hAnsi="Calibri" w:cs="Calibri"/>
+                <w:sz w:val="20"/>
+                <w:szCs w:val="20"/>
+              </w:rPr>
+              <w:t xml:space="preserve">. Grade sheets available </w:t>
+            </w:r>
+            <w:hyperlink r:id="rId8" w:history="1">
+              <w:r>
+                <w:rPr>
+                  <w:rStyle w:val="Hyperlink"/>
+                  <w:rFonts w:ascii="Calibri" w:hAnsi="Calibri" w:cs="Calibri"/>
+                  <w:sz w:val="20"/>
+                  <w:szCs w:val="20"/>
+                </w:rPr>
+                <w:t>here</w:t>
+              </w:r>
+            </w:hyperlink>
+            <w:r>
+              <w:rPr>
+                <w:rFonts w:ascii="Calibri" w:hAnsi="Calibri" w:cs="Calibri"/>
+                <w:sz w:val="20"/>
+                <w:szCs w:val="20"/>
+              </w:rPr>
+              <w:t>.</w:t>
             </w:r>
           </w:p>
           <w:bookmarkEnd w:id="11"/>
@@ -2318,6 +2351,14 @@
               </w:rPr>
               <w:t xml:space="preserve"> (with Honors)</w:t>
             </w:r>
+            <w:r>
+              <w:rPr>
+                <w:rFonts w:ascii="Calibri" w:hAnsi="Calibri" w:cs="Calibri"/>
+                <w:sz w:val="20"/>
+                <w:szCs w:val="20"/>
+              </w:rPr>
+              <w:t>.</w:t>
+            </w:r>
           </w:p>
           <w:bookmarkEnd w:id="12"/>
           <w:p>
@@ -2393,49 +2434,64 @@
               <w:pStyle w:val="Achievement"/>
               <w:rPr>
                 <w:rFonts w:ascii="Calibri" w:hAnsi="Calibri" w:cs="Calibri"/>
+                <w:lang w:val="en-IN"/>
               </w:rPr>
             </w:pPr>
             <w:r>
               <w:rPr>
                 <w:rFonts w:ascii="Calibri" w:hAnsi="Calibri" w:cs="Calibri"/>
-              </w:rPr>
-              <w:t xml:space="preserve">Languages: </w:t>
-            </w:r>
-            <w:r>
-              <w:rPr>
-                <w:rFonts w:ascii="Calibri" w:hAnsi="Calibri" w:cs="Calibri"/>
-              </w:rPr>
-              <w:t>C++</w:t>
-            </w:r>
-            <w:r>
-              <w:rPr>
-                <w:rFonts w:ascii="Calibri" w:hAnsi="Calibri" w:cs="Calibri"/>
-              </w:rPr>
-              <w:t xml:space="preserve">, </w:t>
-            </w:r>
-            <w:r>
-              <w:rPr>
-                <w:rFonts w:ascii="Calibri" w:hAnsi="Calibri" w:cs="Calibri"/>
-              </w:rPr>
-              <w:t xml:space="preserve">Python, Swift, </w:t>
-            </w:r>
-            <w:r>
-              <w:rPr>
-                <w:rFonts w:ascii="Calibri" w:hAnsi="Calibri" w:cs="Calibri"/>
+                <w:lang w:val="en-IN"/>
+              </w:rPr>
+              <w:t xml:space="preserve">Proficient in </w:t>
+            </w:r>
+            <w:r>
+              <w:rPr>
+                <w:rFonts w:ascii="Calibri" w:hAnsi="Calibri" w:cs="Calibri"/>
+                <w:lang w:val="en-IN"/>
+              </w:rPr>
+              <w:t xml:space="preserve">Python (work experience), C++ (data structures &amp; algorithms), </w:t>
+            </w:r>
+            <w:r>
+              <w:rPr>
+                <w:rFonts w:ascii="Calibri" w:hAnsi="Calibri" w:cs="Calibri"/>
+                <w:lang w:val="en-IN"/>
+              </w:rPr>
+              <w:t xml:space="preserve">Swift (internship), </w:t>
+            </w:r>
+            <w:r>
+              <w:rPr>
+                <w:rFonts w:ascii="Calibri" w:hAnsi="Calibri" w:cs="Calibri"/>
+                <w:lang w:val="en-IN"/>
+              </w:rPr>
+              <w:t xml:space="preserve">and </w:t>
+            </w:r>
+            <w:r>
+              <w:rPr>
+                <w:rFonts w:ascii="Calibri" w:hAnsi="Calibri" w:cs="Calibri"/>
+                <w:lang w:val="en-IN"/>
               </w:rPr>
               <w:t xml:space="preserve">Core </w:t>
             </w:r>
             <w:r>
               <w:rPr>
                 <w:rFonts w:ascii="Calibri" w:hAnsi="Calibri" w:cs="Calibri"/>
-              </w:rPr>
-              <w:t xml:space="preserve">Java, </w:t>
-            </w:r>
-            <w:r>
-              <w:rPr>
-                <w:rFonts w:ascii="Calibri" w:hAnsi="Calibri" w:cs="Calibri"/>
-              </w:rPr>
-              <w:t>Bash, SQL, Hive</w:t>
+                <w:lang w:val="en-IN"/>
+              </w:rPr>
+              <w:t>Java</w:t>
+            </w:r>
+            <w:r>
+              <w:rPr>
+                <w:rFonts w:ascii="Calibri" w:hAnsi="Calibri" w:cs="Calibri"/>
+                <w:lang w:val="en-IN"/>
+              </w:rPr>
+              <w:t xml:space="preserve"> (introductory)</w:t>
+            </w:r>
+            <w:r>
+              <w:rPr>
+                <w:rFonts w:ascii="Calibri" w:hAnsi="Calibri" w:cs="Calibri"/>
+                <w:lang w:val="en-IN"/>
+              </w:rPr>
+              <w:t>.</w:t>
             </w:r>
           </w:p>
           <w:p>
@@ -2443,73 +2499,120 @@
               <w:pStyle w:val="Achievement"/>
               <w:rPr>
                 <w:rFonts w:ascii="Calibri" w:hAnsi="Calibri" w:cs="Calibri"/>
+                <w:lang w:val="en-IN"/>
               </w:rPr>
             </w:pPr>
             <w:r>
               <w:rPr>
                 <w:rFonts w:ascii="Calibri" w:hAnsi="Calibri" w:cs="Calibri"/>
-              </w:rPr>
-              <w:t xml:space="preserve">Tools: </w:t>
-            </w:r>
-            <w:r>
-              <w:rPr>
-                <w:rFonts w:ascii="Calibri" w:hAnsi="Calibri" w:cs="Calibri"/>
-              </w:rPr>
-              <w:t>Git</w:t>
-            </w:r>
-            <w:r>
-              <w:rPr>
-                <w:rFonts w:ascii="Calibri" w:hAnsi="Calibri" w:cs="Calibri"/>
-              </w:rPr>
-              <w:t xml:space="preserve"> CLI</w:t>
-            </w:r>
-            <w:r>
-              <w:rPr>
-                <w:rFonts w:ascii="Calibri" w:hAnsi="Calibri" w:cs="Calibri"/>
+                <w:lang w:val="en-IN"/>
+              </w:rPr>
+              <w:t>Strong hold over</w:t>
+            </w:r>
+            <w:r>
+              <w:rPr>
+                <w:rFonts w:ascii="Calibri" w:hAnsi="Calibri" w:cs="Calibri"/>
+                <w:lang w:val="en-IN"/>
+              </w:rPr>
+              <w:t xml:space="preserve"> Linux CLI, </w:t>
+            </w:r>
+            <w:r>
+              <w:rPr>
+                <w:rFonts w:ascii="Calibri" w:hAnsi="Calibri" w:cs="Calibri"/>
+                <w:lang w:val="en-IN"/>
+              </w:rPr>
+              <w:t xml:space="preserve">Bash scripting, </w:t>
+            </w:r>
+            <w:r>
+              <w:rPr>
+                <w:rFonts w:ascii="Calibri" w:hAnsi="Calibri" w:cs="Calibri"/>
+                <w:lang w:val="en-IN"/>
+              </w:rPr>
+              <w:t>Git CLI</w:t>
+            </w:r>
+            <w:r>
+              <w:rPr>
+                <w:rFonts w:ascii="Calibri" w:hAnsi="Calibri" w:cs="Calibri"/>
+                <w:lang w:val="en-IN"/>
+              </w:rPr>
+              <w:t xml:space="preserve"> </w:t>
+            </w:r>
+            <w:r>
+              <w:rPr>
+                <w:rFonts w:ascii="Calibri" w:hAnsi="Calibri" w:cs="Calibri"/>
+                <w:lang w:val="en-IN"/>
+              </w:rPr>
+              <w:t>/</w:t>
+            </w:r>
+            <w:r>
+              <w:rPr>
+                <w:rFonts w:ascii="Calibri" w:hAnsi="Calibri" w:cs="Calibri"/>
+                <w:lang w:val="en-IN"/>
+              </w:rPr>
+              <w:t xml:space="preserve"> </w:t>
+            </w:r>
+            <w:r>
+              <w:rPr>
+                <w:rFonts w:ascii="Calibri" w:hAnsi="Calibri" w:cs="Calibri"/>
+                <w:lang w:val="en-IN"/>
+              </w:rPr>
+              <w:t>GitHub</w:t>
+            </w:r>
+            <w:r>
+              <w:rPr>
+                <w:rFonts w:ascii="Calibri" w:hAnsi="Calibri" w:cs="Calibri"/>
+                <w:lang w:val="en-IN"/>
               </w:rPr>
               <w:t xml:space="preserve">, </w:t>
             </w:r>
             <w:r>
               <w:rPr>
                 <w:rFonts w:ascii="Calibri" w:hAnsi="Calibri" w:cs="Calibri"/>
-              </w:rPr>
-              <w:t xml:space="preserve">*nix CLI, </w:t>
-            </w:r>
-            <w:r>
-              <w:rPr>
-                <w:rFonts w:ascii="Calibri" w:hAnsi="Calibri" w:cs="Calibri"/>
-              </w:rPr>
-              <w:t>Jenkins, XLR</w:t>
-            </w:r>
-            <w:r>
-              <w:rPr>
-                <w:rFonts w:ascii="Calibri" w:hAnsi="Calibri" w:cs="Calibri"/>
-              </w:rPr>
-              <w:t>,</w:t>
-            </w:r>
-            <w:r>
-              <w:rPr>
-                <w:rFonts w:ascii="Calibri" w:hAnsi="Calibri" w:cs="Calibri"/>
-              </w:rPr>
-              <w:t xml:space="preserve"> </w:t>
-            </w:r>
-            <w:r>
-              <w:rPr>
-                <w:rFonts w:ascii="Calibri" w:hAnsi="Calibri" w:cs="Calibri"/>
-              </w:rPr>
-              <w:t xml:space="preserve">Limited Exposure to </w:t>
-            </w:r>
-            <w:r>
-              <w:rPr>
-                <w:rFonts w:ascii="Calibri" w:hAnsi="Calibri" w:cs="Calibri"/>
-              </w:rPr>
-              <w:t xml:space="preserve">Docker and </w:t>
-            </w:r>
-            <w:r>
-              <w:rPr>
-                <w:rFonts w:ascii="Calibri" w:hAnsi="Calibri" w:cs="Calibri"/>
-              </w:rPr>
-              <w:t>Kubernetes</w:t>
+                <w:lang w:val="en-IN"/>
+              </w:rPr>
+              <w:t>and CICD tools like Jenkins</w:t>
+            </w:r>
+            <w:r>
+              <w:rPr>
+                <w:rFonts w:ascii="Calibri" w:hAnsi="Calibri" w:cs="Calibri"/>
+                <w:lang w:val="en-IN"/>
+              </w:rPr>
+              <w:t xml:space="preserve">. </w:t>
+            </w:r>
+            <w:r>
+              <w:rPr>
+                <w:rFonts w:ascii="Calibri" w:hAnsi="Calibri" w:cs="Calibri"/>
+                <w:lang w:val="en-IN"/>
+              </w:rPr>
+              <w:t>Exploring</w:t>
+            </w:r>
+            <w:r>
+              <w:rPr>
+                <w:rFonts w:ascii="Calibri" w:hAnsi="Calibri" w:cs="Calibri"/>
+                <w:lang w:val="en-IN"/>
+              </w:rPr>
+              <w:t xml:space="preserve"> Docker</w:t>
+            </w:r>
+            <w:r>
+              <w:rPr>
+                <w:rFonts w:ascii="Calibri" w:hAnsi="Calibri" w:cs="Calibri"/>
+                <w:lang w:val="en-IN"/>
+              </w:rPr>
+              <w:t xml:space="preserve"> and </w:t>
+            </w:r>
+            <w:r>
+              <w:rPr>
+                <w:rFonts w:ascii="Calibri" w:hAnsi="Calibri" w:cs="Calibri"/>
+                <w:lang w:val="en-IN"/>
+              </w:rPr>
+              <w:t>K8s</w:t>
+            </w:r>
+            <w:r>
+              <w:rPr>
+                <w:rFonts w:ascii="Calibri" w:hAnsi="Calibri" w:cs="Calibri"/>
+                <w:lang w:val="en-IN"/>
+              </w:rPr>
+              <w:t>.</w:t>
             </w:r>
           </w:p>
           <w:p>
@@ -2522,6 +2625,7 @@
               <w:ind w:left="252"/>
               <w:rPr>
                 <w:rFonts w:ascii="Calibri" w:hAnsi="Calibri" w:cs="Calibri"/>
+                <w:lang w:val="en-IN"/>
               </w:rPr>
             </w:pPr>
           </w:p>
@@ -2686,7 +2790,7 @@
               </w:rPr>
               <w:t xml:space="preserve"> Credential ID: </w:t>
             </w:r>
-            <w:hyperlink r:id="rId8" w:history="1">
+            <w:hyperlink r:id="rId9" w:history="1">
               <w:r>
                 <w:rPr>
                   <w:rStyle w:val="Hyperlink"/>
@@ -6043,7 +6147,6 @@
   <w:style w:type="character" w:default="1" w:styleId="DefaultParagraphFont">
     <w:name w:val="Default Paragraph Font"/>
     <w:uiPriority w:val="1"/>
-    <w:semiHidden/>
     <w:unhideWhenUsed/>
   </w:style>
   <w:style w:type="table" w:default="1" w:styleId="TableNormal">

</xml_diff>

<commit_message>
Update skills and projects
</commit_message>
<xml_diff>
--- a/resume/dev/Harshit_Jindal_SDE.docx
+++ b/resume/dev/Harshit_Jindal_SDE.docx
@@ -370,9 +370,9 @@
                 <w:szCs w:val="20"/>
               </w:rPr>
             </w:pPr>
-            <w:bookmarkStart w:id="3" w:name="_Hlk152520120"/>
-            <w:bookmarkStart w:id="4" w:name="_Hlk152521493"/>
-            <w:bookmarkStart w:id="5" w:name="_Hlk144188629"/>
+            <w:bookmarkStart w:id="3" w:name="_Hlk144188629"/>
+            <w:bookmarkStart w:id="4" w:name="_Hlk152520120"/>
+            <w:bookmarkStart w:id="5" w:name="_Hlk152521493"/>
             <w:r>
               <w:rPr>
                 <w:rFonts w:ascii="Calibri" w:hAnsi="Calibri" w:cs="Calibri"/>
@@ -397,7 +397,7 @@
               </w:rPr>
               <w:t xml:space="preserve"> </w:t>
             </w:r>
-            <w:bookmarkEnd w:id="5"/>
+            <w:bookmarkEnd w:id="3"/>
             <w:r>
               <w:rPr>
                 <w:rFonts w:ascii="Calibri" w:hAnsi="Calibri" w:cs="Calibri"/>
@@ -539,7 +539,7 @@
             <w:bookmarkStart w:id="6" w:name="_Hlk152516239"/>
             <w:bookmarkStart w:id="7" w:name="_Hlk152151040"/>
             <w:bookmarkStart w:id="8" w:name="_Hlk152520106"/>
-            <w:bookmarkEnd w:id="3"/>
+            <w:bookmarkEnd w:id="4"/>
             <w:r>
               <w:rPr>
                 <w:rFonts w:ascii="Calibri" w:hAnsi="Calibri" w:cs="Calibri"/>
@@ -1234,7 +1234,7 @@
               <w:t>Promoted from Associate to Sr. Associate in February 2023.</w:t>
             </w:r>
           </w:p>
-          <w:bookmarkEnd w:id="4"/>
+          <w:bookmarkEnd w:id="5"/>
           <w:p>
             <w:pPr>
               <w:ind w:left="252"/>
@@ -2013,23 +2013,7 @@
                 <w:sz w:val="20"/>
                 <w:szCs w:val="20"/>
               </w:rPr>
-              <w:t xml:space="preserve"> (work-integrated </w:t>
-            </w:r>
-            <w:r>
-              <w:rPr>
-                <w:rFonts w:ascii="Calibri" w:hAnsi="Calibri" w:cs="Calibri"/>
-                <w:sz w:val="20"/>
-                <w:szCs w:val="20"/>
-              </w:rPr>
-              <w:t>programme</w:t>
-            </w:r>
-            <w:r>
-              <w:rPr>
-                <w:rFonts w:ascii="Calibri" w:hAnsi="Calibri" w:cs="Calibri"/>
-                <w:sz w:val="20"/>
-                <w:szCs w:val="20"/>
-              </w:rPr>
-              <w:t>)</w:t>
+              <w:t xml:space="preserve"> (work-integrated)</w:t>
             </w:r>
             <w:r>
               <w:rPr>
@@ -2456,35 +2440,14 @@
                 <w:rFonts w:ascii="Calibri" w:hAnsi="Calibri" w:cs="Calibri"/>
                 <w:lang w:val="en-IN"/>
               </w:rPr>
-              <w:t xml:space="preserve">Swift (internship), </w:t>
+              <w:t xml:space="preserve">and </w:t>
             </w:r>
             <w:r>
               <w:rPr>
                 <w:rFonts w:ascii="Calibri" w:hAnsi="Calibri" w:cs="Calibri"/>
                 <w:lang w:val="en-IN"/>
               </w:rPr>
-              <w:t xml:space="preserve">and </w:t>
-            </w:r>
-            <w:r>
-              <w:rPr>
-                <w:rFonts w:ascii="Calibri" w:hAnsi="Calibri" w:cs="Calibri"/>
-                <w:lang w:val="en-IN"/>
-              </w:rPr>
-              <w:t xml:space="preserve">Core </w:t>
-            </w:r>
-            <w:r>
-              <w:rPr>
-                <w:rFonts w:ascii="Calibri" w:hAnsi="Calibri" w:cs="Calibri"/>
-                <w:lang w:val="en-IN"/>
-              </w:rPr>
-              <w:t>Java</w:t>
-            </w:r>
-            <w:r>
-              <w:rPr>
-                <w:rFonts w:ascii="Calibri" w:hAnsi="Calibri" w:cs="Calibri"/>
-                <w:lang w:val="en-IN"/>
-              </w:rPr>
-              <w:t xml:space="preserve"> (introductory)</w:t>
+              <w:t>Swift (internship)</w:t>
             </w:r>
             <w:r>
               <w:rPr>
@@ -2584,28 +2547,105 @@
                 <w:rFonts w:ascii="Calibri" w:hAnsi="Calibri" w:cs="Calibri"/>
                 <w:lang w:val="en-IN"/>
               </w:rPr>
-              <w:t>Exploring</w:t>
+              <w:t>Docker</w:t>
             </w:r>
             <w:r>
               <w:rPr>
                 <w:rFonts w:ascii="Calibri" w:hAnsi="Calibri" w:cs="Calibri"/>
                 <w:lang w:val="en-IN"/>
               </w:rPr>
-              <w:t xml:space="preserve"> Docker</w:t>
+              <w:t xml:space="preserve"> and </w:t>
             </w:r>
             <w:r>
               <w:rPr>
                 <w:rFonts w:ascii="Calibri" w:hAnsi="Calibri" w:cs="Calibri"/>
                 <w:lang w:val="en-IN"/>
               </w:rPr>
-              <w:t xml:space="preserve"> and </w:t>
+              <w:t>K8s</w:t>
             </w:r>
             <w:r>
               <w:rPr>
                 <w:rFonts w:ascii="Calibri" w:hAnsi="Calibri" w:cs="Calibri"/>
                 <w:lang w:val="en-IN"/>
               </w:rPr>
-              <w:t>K8s</w:t>
+              <w:t xml:space="preserve"> fundamentals.</w:t>
+            </w:r>
+          </w:p>
+          <w:p>
+            <w:pPr>
+              <w:pStyle w:val="Achievement"/>
+              <w:numPr>
+                <w:ilvl w:val="0"/>
+                <w:numId w:val="0"/>
+              </w:numPr>
+              <w:ind w:left="252"/>
+              <w:rPr>
+                <w:rFonts w:ascii="Calibri" w:hAnsi="Calibri" w:cs="Calibri"/>
+                <w:lang w:val="en-IN"/>
+              </w:rPr>
+            </w:pPr>
+            <w:r>
+              <w:rPr>
+                <w:rFonts w:ascii="Calibri" w:hAnsi="Calibri" w:cs="Calibri"/>
+                <w:lang w:val="en-IN"/>
+              </w:rPr>
+              <w:t xml:space="preserve">Experience with </w:t>
+            </w:r>
+            <w:r>
+              <w:rPr>
+                <w:rFonts w:ascii="Calibri" w:hAnsi="Calibri" w:cs="Calibri"/>
+                <w:lang w:val="en-IN"/>
+              </w:rPr>
+              <w:t xml:space="preserve">AWS S3, EC2, Lambda, </w:t>
+            </w:r>
+            <w:r>
+              <w:rPr>
+                <w:rFonts w:ascii="Calibri" w:hAnsi="Calibri" w:cs="Calibri"/>
+                <w:lang w:val="en-IN"/>
+              </w:rPr>
+              <w:t xml:space="preserve">IAM, </w:t>
+            </w:r>
+            <w:r>
+              <w:rPr>
+                <w:rFonts w:ascii="Calibri" w:hAnsi="Calibri" w:cs="Calibri"/>
+                <w:lang w:val="en-IN"/>
+              </w:rPr>
+              <w:t xml:space="preserve">SES, </w:t>
+            </w:r>
+            <w:r>
+              <w:rPr>
+                <w:rFonts w:ascii="Calibri" w:hAnsi="Calibri" w:cs="Calibri"/>
+                <w:lang w:val="en-IN"/>
+              </w:rPr>
+              <w:t xml:space="preserve">and </w:t>
+            </w:r>
+            <w:r>
+              <w:rPr>
+                <w:rFonts w:ascii="Calibri" w:hAnsi="Calibri" w:cs="Calibri"/>
+                <w:lang w:val="en-IN"/>
+              </w:rPr>
+              <w:t>Route 53</w:t>
+            </w:r>
+            <w:r>
+              <w:rPr>
+                <w:rFonts w:ascii="Calibri" w:hAnsi="Calibri" w:cs="Calibri"/>
+                <w:lang w:val="en-IN"/>
+              </w:rPr>
+              <w:t xml:space="preserve"> for </w:t>
+            </w:r>
+            <w:r>
+              <w:rPr>
+                <w:rFonts w:ascii="Calibri" w:hAnsi="Calibri" w:cs="Calibri"/>
+                <w:lang w:val="en-IN"/>
+              </w:rPr>
+              <w:t>personal</w:t>
+            </w:r>
+            <w:r>
+              <w:rPr>
+                <w:rFonts w:ascii="Calibri" w:hAnsi="Calibri" w:cs="Calibri"/>
+                <w:lang w:val="en-IN"/>
+              </w:rPr>
+              <w:t xml:space="preserve"> projects</w:t>
             </w:r>
             <w:r>
               <w:rPr>
@@ -2882,42 +2922,131 @@
                 <w:szCs w:val="20"/>
               </w:rPr>
             </w:pPr>
+            <w:bookmarkStart w:id="13" w:name="_Hlk158942803"/>
             <w:r>
               <w:rPr>
                 <w:rFonts w:ascii="Calibri" w:hAnsi="Calibri" w:cs="Calibri"/>
                 <w:b/>
-                <w:sz w:val="20"/>
-                <w:szCs w:val="20"/>
-              </w:rPr>
-              <w:t xml:space="preserve">Cosmic Artifact Filter: </w:t>
-            </w:r>
-            <w:r>
-              <w:rPr>
-                <w:rFonts w:ascii="Calibri" w:hAnsi="Calibri" w:cs="Calibri"/>
                 <w:bCs/>
                 <w:sz w:val="20"/>
                 <w:szCs w:val="20"/>
               </w:rPr>
-              <w:t>Trained a deep learning model</w:t>
-            </w:r>
-            <w:r>
-              <w:rPr>
-                <w:rFonts w:ascii="Calibri" w:hAnsi="Calibri" w:cs="Calibri"/>
-                <w:bCs/>
-                <w:sz w:val="20"/>
-                <w:szCs w:val="20"/>
-              </w:rPr>
-              <w:t xml:space="preserve"> using fast.ai</w:t>
-            </w:r>
-            <w:r>
-              <w:rPr>
-                <w:rFonts w:ascii="Calibri" w:hAnsi="Calibri" w:cs="Calibri"/>
-                <w:bCs/>
-                <w:sz w:val="20"/>
-                <w:szCs w:val="20"/>
-              </w:rPr>
-              <w:t xml:space="preserve"> to flag cosmic ray artifacts in satellite imagery for deeper analysis using image data from NASA’s MESSENGER Spacecraft orbiting the planet Mercury.</w:t>
-            </w:r>
+              <w:t xml:space="preserve">Online Presence: </w:t>
+            </w:r>
+            <w:r>
+              <w:rPr>
+                <w:rFonts w:ascii="Calibri" w:hAnsi="Calibri" w:cs="Calibri"/>
+                <w:sz w:val="20"/>
+                <w:szCs w:val="20"/>
+              </w:rPr>
+              <w:t xml:space="preserve">Developed a website at </w:t>
+            </w:r>
+            <w:hyperlink r:id="rId10" w:history="1">
+              <w:r>
+                <w:rPr>
+                  <w:rStyle w:val="Hyperlink"/>
+                  <w:rFonts w:ascii="Calibri" w:hAnsi="Calibri" w:cs="Calibri"/>
+                  <w:sz w:val="20"/>
+                  <w:szCs w:val="20"/>
+                </w:rPr>
+                <w:t>https://harshitjindal.com</w:t>
+              </w:r>
+            </w:hyperlink>
+            <w:r>
+              <w:rPr>
+                <w:rFonts w:ascii="Calibri" w:hAnsi="Calibri" w:cs="Calibri"/>
+                <w:sz w:val="20"/>
+                <w:szCs w:val="20"/>
+              </w:rPr>
+              <w:t xml:space="preserve"> to host static content such as resume, grade sheets, and custom links like </w:t>
+            </w:r>
+            <w:hyperlink r:id="rId11" w:history="1">
+              <w:r>
+                <w:rPr>
+                  <w:rStyle w:val="Hyperlink"/>
+                  <w:rFonts w:ascii="Calibri" w:hAnsi="Calibri" w:cs="Calibri"/>
+                  <w:sz w:val="20"/>
+                  <w:szCs w:val="20"/>
+                </w:rPr>
+                <w:t>https://harshitjindal.com/linkedin</w:t>
+              </w:r>
+            </w:hyperlink>
+            <w:r>
+              <w:rPr>
+                <w:rFonts w:ascii="Calibri" w:hAnsi="Calibri" w:cs="Calibri"/>
+                <w:sz w:val="20"/>
+                <w:szCs w:val="20"/>
+              </w:rPr>
+              <w:t xml:space="preserve"> for easy navigation. Used DNS management to set up a personalized domain name (CNAME) and </w:t>
+            </w:r>
+            <w:hyperlink r:id="rId12" w:history="1">
+              <w:r>
+                <w:rPr>
+                  <w:rStyle w:val="Hyperlink"/>
+                  <w:rFonts w:ascii="Calibri" w:hAnsi="Calibri" w:cs="Calibri"/>
+                  <w:sz w:val="20"/>
+                  <w:szCs w:val="20"/>
+                </w:rPr>
+                <w:t>contact@harshitjindal.com</w:t>
+              </w:r>
+            </w:hyperlink>
+            <w:r>
+              <w:rPr>
+                <w:rFonts w:ascii="Calibri" w:hAnsi="Calibri" w:cs="Calibri"/>
+                <w:sz w:val="20"/>
+                <w:szCs w:val="20"/>
+              </w:rPr>
+              <w:t xml:space="preserve"> (MX records) for both </w:t>
+            </w:r>
+            <w:r>
+              <w:rPr>
+                <w:rFonts w:ascii="Calibri" w:hAnsi="Calibri" w:cs="Calibri"/>
+                <w:sz w:val="20"/>
+                <w:szCs w:val="20"/>
+              </w:rPr>
+              <w:t>inbound</w:t>
+            </w:r>
+            <w:r>
+              <w:rPr>
+                <w:rFonts w:ascii="Calibri" w:hAnsi="Calibri" w:cs="Calibri"/>
+                <w:sz w:val="20"/>
+                <w:szCs w:val="20"/>
+              </w:rPr>
+              <w:t xml:space="preserve"> and </w:t>
+            </w:r>
+            <w:r>
+              <w:rPr>
+                <w:rFonts w:ascii="Calibri" w:hAnsi="Calibri" w:cs="Calibri"/>
+                <w:sz w:val="20"/>
+                <w:szCs w:val="20"/>
+              </w:rPr>
+              <w:t>outbound</w:t>
+            </w:r>
+            <w:r>
+              <w:rPr>
+                <w:rFonts w:ascii="Calibri" w:hAnsi="Calibri" w:cs="Calibri"/>
+                <w:sz w:val="20"/>
+                <w:szCs w:val="20"/>
+              </w:rPr>
+              <w:t xml:space="preserve"> </w:t>
+            </w:r>
+            <w:r>
+              <w:rPr>
+                <w:rFonts w:ascii="Calibri" w:hAnsi="Calibri" w:cs="Calibri"/>
+                <w:sz w:val="20"/>
+                <w:szCs w:val="20"/>
+              </w:rPr>
+              <w:t>emails</w:t>
+            </w:r>
+            <w:r>
+              <w:rPr>
+                <w:rFonts w:ascii="Calibri" w:hAnsi="Calibri" w:cs="Calibri"/>
+                <w:sz w:val="20"/>
+                <w:szCs w:val="20"/>
+              </w:rPr>
+              <w:t>.</w:t>
+            </w:r>
+            <w:bookmarkEnd w:id="13"/>
           </w:p>
           <w:p>
             <w:pPr>
@@ -2943,7 +3072,7 @@
                 <w:sz w:val="20"/>
                 <w:szCs w:val="20"/>
               </w:rPr>
-              <w:t xml:space="preserve">Dark Matter Discovery: </w:t>
+              <w:t xml:space="preserve">Cosmic Artifact Filter: </w:t>
             </w:r>
             <w:r>
               <w:rPr>
@@ -2952,7 +3081,25 @@
                 <w:sz w:val="20"/>
                 <w:szCs w:val="20"/>
               </w:rPr>
-              <w:t>Built a pipeline to visualize and confirm the presence of dark matter in cosmic data based on the principle of Strong Gravitational Lensing, using PyAutoLens.</w:t>
+              <w:t>Trained a deep learning model</w:t>
+            </w:r>
+            <w:r>
+              <w:rPr>
+                <w:rFonts w:ascii="Calibri" w:hAnsi="Calibri" w:cs="Calibri"/>
+                <w:bCs/>
+                <w:sz w:val="20"/>
+                <w:szCs w:val="20"/>
+              </w:rPr>
+              <w:t xml:space="preserve"> using fast.ai</w:t>
+            </w:r>
+            <w:r>
+              <w:rPr>
+                <w:rFonts w:ascii="Calibri" w:hAnsi="Calibri" w:cs="Calibri"/>
+                <w:bCs/>
+                <w:sz w:val="20"/>
+                <w:szCs w:val="20"/>
+              </w:rPr>
+              <w:t xml:space="preserve"> to flag cosmic ray artifacts in satellite imagery for deeper analysis using image data from NASA’s MESSENGER Spacecraft orbiting the planet Mercury.</w:t>
             </w:r>
           </w:p>
           <w:p>
@@ -2979,57 +3126,16 @@
                 <w:sz w:val="20"/>
                 <w:szCs w:val="20"/>
               </w:rPr>
-              <w:t xml:space="preserve">Live </w:t>
-            </w:r>
-            <w:r>
-              <w:rPr>
-                <w:rFonts w:ascii="Calibri" w:hAnsi="Calibri" w:cs="Calibri"/>
-                <w:b/>
-                <w:sz w:val="20"/>
-                <w:szCs w:val="20"/>
-              </w:rPr>
-              <w:t>Accident Detection:</w:t>
-            </w:r>
-            <w:r>
-              <w:rPr>
-                <w:rFonts w:ascii="Calibri" w:hAnsi="Calibri" w:cs="Calibri"/>
-                <w:sz w:val="20"/>
-                <w:szCs w:val="20"/>
-              </w:rPr>
-              <w:t xml:space="preserve"> Used transfer learning to train a</w:t>
-            </w:r>
-            <w:r>
-              <w:rPr>
-                <w:rFonts w:ascii="Calibri" w:hAnsi="Calibri" w:cs="Calibri"/>
-                <w:sz w:val="20"/>
-                <w:szCs w:val="20"/>
-              </w:rPr>
-              <w:t xml:space="preserve"> ML</w:t>
-            </w:r>
-            <w:r>
-              <w:rPr>
-                <w:rFonts w:ascii="Calibri" w:hAnsi="Calibri" w:cs="Calibri"/>
-                <w:sz w:val="20"/>
-                <w:szCs w:val="20"/>
-              </w:rPr>
-              <w:t xml:space="preserve"> model capable of processing live video camera feed at traffic intersections to spot road accidents. Secured 3</w:t>
-            </w:r>
-            <w:r>
-              <w:rPr>
-                <w:rFonts w:ascii="Calibri" w:hAnsi="Calibri" w:cs="Calibri"/>
-                <w:sz w:val="20"/>
-                <w:szCs w:val="20"/>
-                <w:vertAlign w:val="superscript"/>
-              </w:rPr>
-              <w:t>rd</w:t>
-            </w:r>
-            <w:r>
-              <w:rPr>
-                <w:rFonts w:ascii="Calibri" w:hAnsi="Calibri" w:cs="Calibri"/>
-                <w:sz w:val="20"/>
-                <w:szCs w:val="20"/>
-              </w:rPr>
-              <w:t xml:space="preserve"> place at OctaHacks Hackathon 2019.</w:t>
+              <w:t xml:space="preserve">Dark Matter Discovery: </w:t>
+            </w:r>
+            <w:r>
+              <w:rPr>
+                <w:rFonts w:ascii="Calibri" w:hAnsi="Calibri" w:cs="Calibri"/>
+                <w:bCs/>
+                <w:sz w:val="20"/>
+                <w:szCs w:val="20"/>
+              </w:rPr>
+              <w:t>Built a pipeline to visualize and confirm the presence of dark matter in cosmic data based on the principle of Strong Gravitational Lensing, using PyAutoLens.</w:t>
             </w:r>
           </w:p>
           <w:p>
@@ -3053,67 +3159,60 @@
               <w:rPr>
                 <w:rFonts w:ascii="Calibri" w:hAnsi="Calibri" w:cs="Calibri"/>
                 <w:b/>
-                <w:bCs/>
-                <w:sz w:val="20"/>
-                <w:szCs w:val="20"/>
-              </w:rPr>
-              <w:t>[Brain-Computer Interfacing] Cognitive Neuroscience:</w:t>
-            </w:r>
-            <w:r>
-              <w:rPr>
-                <w:rFonts w:ascii="Calibri" w:hAnsi="Calibri" w:cs="Calibri"/>
-                <w:sz w:val="20"/>
-                <w:szCs w:val="20"/>
-              </w:rPr>
-              <w:t xml:space="preserve"> Wrote </w:t>
-            </w:r>
-            <w:r>
-              <w:rPr>
-                <w:rFonts w:ascii="Calibri" w:hAnsi="Calibri" w:cs="Calibri"/>
-                <w:sz w:val="20"/>
-                <w:szCs w:val="20"/>
-              </w:rPr>
-              <w:t xml:space="preserve">Arduino </w:t>
-            </w:r>
-            <w:r>
-              <w:rPr>
-                <w:rFonts w:ascii="Calibri" w:hAnsi="Calibri" w:cs="Calibri"/>
-                <w:sz w:val="20"/>
-                <w:szCs w:val="20"/>
-              </w:rPr>
-              <w:t>software</w:t>
-            </w:r>
-            <w:r>
-              <w:rPr>
-                <w:rFonts w:ascii="Calibri" w:hAnsi="Calibri" w:cs="Calibri"/>
-                <w:sz w:val="20"/>
-                <w:szCs w:val="20"/>
-              </w:rPr>
-              <w:t xml:space="preserve"> in C</w:t>
-            </w:r>
-            <w:r>
-              <w:rPr>
-                <w:rFonts w:ascii="Calibri" w:hAnsi="Calibri" w:cs="Calibri"/>
-                <w:sz w:val="20"/>
-                <w:szCs w:val="20"/>
-              </w:rPr>
-              <w:t xml:space="preserve"> to detect muscle artifacts in real-time EEG data </w:t>
-            </w:r>
-            <w:r>
-              <w:rPr>
-                <w:rFonts w:ascii="Calibri" w:hAnsi="Calibri" w:cs="Calibri"/>
-                <w:sz w:val="20"/>
-                <w:szCs w:val="20"/>
-              </w:rPr>
-              <w:t xml:space="preserve">collected </w:t>
-            </w:r>
-            <w:r>
-              <w:rPr>
-                <w:rFonts w:ascii="Calibri" w:hAnsi="Calibri" w:cs="Calibri"/>
-                <w:sz w:val="20"/>
-                <w:szCs w:val="20"/>
-              </w:rPr>
-              <w:t>from the NeuroSky MindWave headset, with the potential for upgraded brain mapping by attenuation of the recognized artifacts. It was tested on the Left Frontal Lobe with &gt;95% accuracy.</w:t>
+                <w:sz w:val="20"/>
+                <w:szCs w:val="20"/>
+              </w:rPr>
+              <w:t xml:space="preserve">Live </w:t>
+            </w:r>
+            <w:r>
+              <w:rPr>
+                <w:rFonts w:ascii="Calibri" w:hAnsi="Calibri" w:cs="Calibri"/>
+                <w:b/>
+                <w:sz w:val="20"/>
+                <w:szCs w:val="20"/>
+              </w:rPr>
+              <w:t>Accident Detection:</w:t>
+            </w:r>
+            <w:r>
+              <w:rPr>
+                <w:rFonts w:ascii="Calibri" w:hAnsi="Calibri" w:cs="Calibri"/>
+                <w:sz w:val="20"/>
+                <w:szCs w:val="20"/>
+              </w:rPr>
+              <w:t xml:space="preserve"> Used transfer learning to train a</w:t>
+            </w:r>
+            <w:r>
+              <w:rPr>
+                <w:rFonts w:ascii="Calibri" w:hAnsi="Calibri" w:cs="Calibri"/>
+                <w:sz w:val="20"/>
+                <w:szCs w:val="20"/>
+              </w:rPr>
+              <w:t xml:space="preserve"> ML</w:t>
+            </w:r>
+            <w:r>
+              <w:rPr>
+                <w:rFonts w:ascii="Calibri" w:hAnsi="Calibri" w:cs="Calibri"/>
+                <w:sz w:val="20"/>
+                <w:szCs w:val="20"/>
+              </w:rPr>
+              <w:t xml:space="preserve"> model capable of processing live video camera feed at traffic intersections to spot road accidents. Secured 3</w:t>
+            </w:r>
+            <w:r>
+              <w:rPr>
+                <w:rFonts w:ascii="Calibri" w:hAnsi="Calibri" w:cs="Calibri"/>
+                <w:sz w:val="20"/>
+                <w:szCs w:val="20"/>
+                <w:vertAlign w:val="superscript"/>
+              </w:rPr>
+              <w:t>rd</w:t>
+            </w:r>
+            <w:r>
+              <w:rPr>
+                <w:rFonts w:ascii="Calibri" w:hAnsi="Calibri" w:cs="Calibri"/>
+                <w:sz w:val="20"/>
+                <w:szCs w:val="20"/>
+              </w:rPr>
+              <w:t xml:space="preserve"> place at OctaHacks Hackathon 2019.</w:t>
             </w:r>
           </w:p>
           <w:p>
@@ -3141,6 +3240,90 @@
                 <w:sz w:val="20"/>
                 <w:szCs w:val="20"/>
               </w:rPr>
+              <w:t>[Brain-Computer Interfacing] Cognitive Neuroscience:</w:t>
+            </w:r>
+            <w:r>
+              <w:rPr>
+                <w:rFonts w:ascii="Calibri" w:hAnsi="Calibri" w:cs="Calibri"/>
+                <w:sz w:val="20"/>
+                <w:szCs w:val="20"/>
+              </w:rPr>
+              <w:t xml:space="preserve"> Wrote </w:t>
+            </w:r>
+            <w:r>
+              <w:rPr>
+                <w:rFonts w:ascii="Calibri" w:hAnsi="Calibri" w:cs="Calibri"/>
+                <w:sz w:val="20"/>
+                <w:szCs w:val="20"/>
+              </w:rPr>
+              <w:t xml:space="preserve">Arduino </w:t>
+            </w:r>
+            <w:r>
+              <w:rPr>
+                <w:rFonts w:ascii="Calibri" w:hAnsi="Calibri" w:cs="Calibri"/>
+                <w:sz w:val="20"/>
+                <w:szCs w:val="20"/>
+              </w:rPr>
+              <w:t>software</w:t>
+            </w:r>
+            <w:r>
+              <w:rPr>
+                <w:rFonts w:ascii="Calibri" w:hAnsi="Calibri" w:cs="Calibri"/>
+                <w:sz w:val="20"/>
+                <w:szCs w:val="20"/>
+              </w:rPr>
+              <w:t xml:space="preserve"> in C</w:t>
+            </w:r>
+            <w:r>
+              <w:rPr>
+                <w:rFonts w:ascii="Calibri" w:hAnsi="Calibri" w:cs="Calibri"/>
+                <w:sz w:val="20"/>
+                <w:szCs w:val="20"/>
+              </w:rPr>
+              <w:t xml:space="preserve"> to detect muscle artifacts in real-time EEG data </w:t>
+            </w:r>
+            <w:r>
+              <w:rPr>
+                <w:rFonts w:ascii="Calibri" w:hAnsi="Calibri" w:cs="Calibri"/>
+                <w:sz w:val="20"/>
+                <w:szCs w:val="20"/>
+              </w:rPr>
+              <w:t xml:space="preserve">collected </w:t>
+            </w:r>
+            <w:r>
+              <w:rPr>
+                <w:rFonts w:ascii="Calibri" w:hAnsi="Calibri" w:cs="Calibri"/>
+                <w:sz w:val="20"/>
+                <w:szCs w:val="20"/>
+              </w:rPr>
+              <w:t>from the NeuroSky MindWave headset, with the potential for upgraded brain mapping by attenuation of the recognized artifacts. It was tested on the Left Frontal Lobe with &gt;95% accuracy.</w:t>
+            </w:r>
+          </w:p>
+          <w:p>
+            <w:pPr>
+              <w:numPr>
+                <w:ilvl w:val="0"/>
+                <w:numId w:val="7"/>
+              </w:numPr>
+              <w:tabs>
+                <w:tab w:val="clear" w:pos="916"/>
+              </w:tabs>
+              <w:ind w:left="252" w:hanging="180"/>
+              <w:jc w:val="both"/>
+              <w:rPr>
+                <w:rFonts w:ascii="Calibri" w:hAnsi="Calibri" w:cs="Calibri"/>
+                <w:sz w:val="20"/>
+                <w:szCs w:val="20"/>
+              </w:rPr>
+            </w:pPr>
+            <w:r>
+              <w:rPr>
+                <w:rFonts w:ascii="Calibri" w:hAnsi="Calibri" w:cs="Calibri"/>
+                <w:b/>
+                <w:bCs/>
+                <w:sz w:val="20"/>
+                <w:szCs w:val="20"/>
+              </w:rPr>
               <w:t>[iOS Software</w:t>
             </w:r>
             <w:r>
@@ -3190,7 +3373,7 @@
                 <w:sz w:val="20"/>
                 <w:szCs w:val="20"/>
               </w:rPr>
-              <w:t xml:space="preserve"> for a client in Bristol, United States, that scan</w:t>
+              <w:t xml:space="preserve"> that scan</w:t>
             </w:r>
             <w:r>
               <w:rPr>
@@ -3235,102 +3418,6 @@
           </w:p>
         </w:tc>
       </w:tr>
-      <w:tr>
-        <w:trPr>
-          <w:trHeight w:val="195"/>
-        </w:trPr>
-        <w:tc>
-          <w:tcPr>
-            <w:tcW w:w="5000" w:type="pct"/>
-            <w:gridSpan w:val="8"/>
-            <w:tcBorders>
-              <w:bottom w:val="single" w:sz="4" w:space="0" w:color="auto"/>
-            </w:tcBorders>
-            <w:shd w:val="clear" w:color="auto" w:fill="auto"/>
-          </w:tcPr>
-          <w:p>
-            <w:pPr>
-              <w:rPr>
-                <w:rFonts w:ascii="Calibri" w:hAnsi="Calibri" w:cs="Calibri"/>
-                <w:b/>
-                <w:smallCaps/>
-                <w:spacing w:val="86"/>
-                <w:sz w:val="20"/>
-                <w:szCs w:val="20"/>
-              </w:rPr>
-            </w:pPr>
-            <w:bookmarkStart w:id="13" w:name="_Hlk158931507"/>
-            <w:r>
-              <w:rPr>
-                <w:rFonts w:ascii="Calibri" w:hAnsi="Calibri" w:cs="Calibri"/>
-                <w:b/>
-                <w:smallCaps/>
-                <w:sz w:val="20"/>
-                <w:szCs w:val="20"/>
-              </w:rPr>
-              <w:t>Volunteer &amp; Additional Experience</w:t>
-            </w:r>
-          </w:p>
-        </w:tc>
-      </w:tr>
-      <w:tr>
-        <w:trPr>
-          <w:trHeight w:val="563"/>
-        </w:trPr>
-        <w:tc>
-          <w:tcPr>
-            <w:tcW w:w="5000" w:type="pct"/>
-            <w:gridSpan w:val="8"/>
-            <w:tcBorders>
-              <w:top w:val="single" w:sz="4" w:space="0" w:color="auto"/>
-            </w:tcBorders>
-            <w:shd w:val="clear" w:color="auto" w:fill="auto"/>
-          </w:tcPr>
-          <w:p>
-            <w:pPr>
-              <w:pStyle w:val="Achievement"/>
-              <w:rPr>
-                <w:rFonts w:ascii="Calibri" w:hAnsi="Calibri" w:cs="Calibri"/>
-              </w:rPr>
-            </w:pPr>
-            <w:r>
-              <w:rPr>
-                <w:rFonts w:ascii="Calibri" w:hAnsi="Calibri" w:cs="Calibri"/>
-                <w:b/>
-              </w:rPr>
-              <w:t>Speaker at the Programming Club, UIET:</w:t>
-            </w:r>
-            <w:r>
-              <w:rPr>
-                <w:rFonts w:ascii="Calibri" w:hAnsi="Calibri" w:cs="Calibri"/>
-              </w:rPr>
-              <w:t xml:space="preserve"> Guided freshmen CS students and taught introductory Machine Learning.</w:t>
-            </w:r>
-          </w:p>
-          <w:p>
-            <w:pPr>
-              <w:pStyle w:val="Achievement"/>
-              <w:rPr>
-                <w:rFonts w:ascii="Calibri" w:hAnsi="Calibri" w:cs="Calibri"/>
-              </w:rPr>
-            </w:pPr>
-            <w:r>
-              <w:rPr>
-                <w:rFonts w:ascii="Calibri" w:hAnsi="Calibri" w:cs="Calibri"/>
-                <w:b/>
-              </w:rPr>
-              <w:t>Mowgli Aid:</w:t>
-            </w:r>
-            <w:r>
-              <w:rPr>
-                <w:rFonts w:ascii="Calibri" w:hAnsi="Calibri" w:cs="Calibri"/>
-              </w:rPr>
-              <w:t xml:space="preserve"> Volunteering to rescue and rehabilitate stray and injured animals in the Chandigarh Tricity Area.</w:t>
-            </w:r>
-          </w:p>
-        </w:tc>
-      </w:tr>
-      <w:bookmarkEnd w:id="13"/>
     </w:tbl>
     <w:p>
       <w:pPr>
@@ -6147,6 +6234,7 @@
   <w:style w:type="character" w:default="1" w:styleId="DefaultParagraphFont">
     <w:name w:val="Default Paragraph Font"/>
     <w:uiPriority w:val="1"/>
+    <w:semiHidden/>
     <w:unhideWhenUsed/>
   </w:style>
   <w:style w:type="table" w:default="1" w:styleId="TableNormal">

</xml_diff>